<commit_message>
Regenerate Word docs with equation-editor equations, embedded figures, and italic symbols
</commit_message>
<xml_diff>
--- a/Manuscript_EMHD_Carreau_Hybrid_Nanofluid_Equations.docx
+++ b/Manuscript_EMHD_Carreau_Hybrid_Nanofluid_Equations.docx
@@ -20356,8 +20356,45 @@
     </w:p>
     <w:p/>
     <w:p>
-      <w:r>
-        <w:t xml:space="preserve">[Figure placeholder: figures_emhd/Figure_1_Schematic.png]</w:t>
+      <w:pPr>
+        <w:jc w:val="center"/>
+      </w:pPr>
+      <w:r>
+        <w:drawing>
+          <wp:inline xmlns:wp="http://schemas.openxmlformats.org/drawingml/2006/wordprocessingDrawing" distT="0" distB="0" distL="0" distR="0">
+            <wp:extent cx="5400000" cy="3978947"/>
+            <wp:effectExtent l="0" t="0" r="0" b="0"/>
+            <wp:docPr id="1001" name="Figure1"/>
+            <wp:cNvGraphicFramePr>
+              <a:graphicFrameLocks xmlns:a="http://schemas.openxmlformats.org/drawingml/2006/main" noChangeAspect="1"/>
+            </wp:cNvGraphicFramePr>
+            <a:graphic xmlns:a="http://schemas.openxmlformats.org/drawingml/2006/main">
+              <a:graphicData uri="http://schemas.openxmlformats.org/drawingml/2006/picture">
+                <pic:pic xmlns:pic="http://schemas.openxmlformats.org/drawingml/2006/picture">
+                  <pic:nvPicPr>
+                    <pic:cNvPr id="1001" name="Figure1"/>
+                    <pic:cNvPicPr/>
+                  </pic:nvPicPr>
+                  <pic:blipFill>
+                    <a:blip r:embed="rIdImg1"/>
+                    <a:stretch>
+                      <a:fillRect/>
+                    </a:stretch>
+                  </pic:blipFill>
+                  <pic:spPr>
+                    <a:xfrm>
+                      <a:off x="0" y="0"/>
+                      <a:ext cx="5400000" cy="3978947"/>
+                    </a:xfrm>
+                    <a:prstGeom prst="rect">
+                      <a:avLst/>
+                    </a:prstGeom>
+                  </pic:spPr>
+                </pic:pic>
+              </a:graphicData>
+            </a:graphic>
+          </wp:inline>
+        </w:drawing>
       </w:r>
     </w:p>
     <w:p/>
@@ -20637,8 +20674,45 @@
     </w:p>
     <w:p/>
     <w:p>
-      <w:r>
-        <w:t xml:space="preserve">[Figure placeholder: figures_emhd/Figure_2_Velocity_Sq.png]</w:t>
+      <w:pPr>
+        <w:jc w:val="center"/>
+      </w:pPr>
+      <w:r>
+        <w:drawing>
+          <wp:inline xmlns:wp="http://schemas.openxmlformats.org/drawingml/2006/wordprocessingDrawing" distT="0" distB="0" distL="0" distR="0">
+            <wp:extent cx="5400000" cy="3978947"/>
+            <wp:effectExtent l="0" t="0" r="0" b="0"/>
+            <wp:docPr id="1002" name="Figure2"/>
+            <wp:cNvGraphicFramePr>
+              <a:graphicFrameLocks xmlns:a="http://schemas.openxmlformats.org/drawingml/2006/main" noChangeAspect="1"/>
+            </wp:cNvGraphicFramePr>
+            <a:graphic xmlns:a="http://schemas.openxmlformats.org/drawingml/2006/main">
+              <a:graphicData uri="http://schemas.openxmlformats.org/drawingml/2006/picture">
+                <pic:pic xmlns:pic="http://schemas.openxmlformats.org/drawingml/2006/picture">
+                  <pic:nvPicPr>
+                    <pic:cNvPr id="1002" name="Figure2"/>
+                    <pic:cNvPicPr/>
+                  </pic:nvPicPr>
+                  <pic:blipFill>
+                    <a:blip r:embed="rIdImg2"/>
+                    <a:stretch>
+                      <a:fillRect/>
+                    </a:stretch>
+                  </pic:blipFill>
+                  <pic:spPr>
+                    <a:xfrm>
+                      <a:off x="0" y="0"/>
+                      <a:ext cx="5400000" cy="3978947"/>
+                    </a:xfrm>
+                    <a:prstGeom prst="rect">
+                      <a:avLst/>
+                    </a:prstGeom>
+                  </pic:spPr>
+                </pic:pic>
+              </a:graphicData>
+            </a:graphic>
+          </wp:inline>
+        </w:drawing>
       </w:r>
     </w:p>
     <w:p/>
@@ -20816,8 +20890,45 @@
     </w:p>
     <w:p/>
     <w:p>
-      <w:r>
-        <w:t xml:space="preserve">[Figure placeholder: figures_emhd/Figure_3_Velocity_We_M.png]</w:t>
+      <w:pPr>
+        <w:jc w:val="center"/>
+      </w:pPr>
+      <w:r>
+        <w:drawing>
+          <wp:inline xmlns:wp="http://schemas.openxmlformats.org/drawingml/2006/wordprocessingDrawing" distT="0" distB="0" distL="0" distR="0">
+            <wp:extent cx="5400000" cy="3978947"/>
+            <wp:effectExtent l="0" t="0" r="0" b="0"/>
+            <wp:docPr id="1003" name="Figure3"/>
+            <wp:cNvGraphicFramePr>
+              <a:graphicFrameLocks xmlns:a="http://schemas.openxmlformats.org/drawingml/2006/main" noChangeAspect="1"/>
+            </wp:cNvGraphicFramePr>
+            <a:graphic xmlns:a="http://schemas.openxmlformats.org/drawingml/2006/main">
+              <a:graphicData uri="http://schemas.openxmlformats.org/drawingml/2006/picture">
+                <pic:pic xmlns:pic="http://schemas.openxmlformats.org/drawingml/2006/picture">
+                  <pic:nvPicPr>
+                    <pic:cNvPr id="1003" name="Figure3"/>
+                    <pic:cNvPicPr/>
+                  </pic:nvPicPr>
+                  <pic:blipFill>
+                    <a:blip r:embed="rIdImg3"/>
+                    <a:stretch>
+                      <a:fillRect/>
+                    </a:stretch>
+                  </pic:blipFill>
+                  <pic:spPr>
+                    <a:xfrm>
+                      <a:off x="0" y="0"/>
+                      <a:ext cx="5400000" cy="3978947"/>
+                    </a:xfrm>
+                    <a:prstGeom prst="rect">
+                      <a:avLst/>
+                    </a:prstGeom>
+                  </pic:spPr>
+                </pic:pic>
+              </a:graphicData>
+            </a:graphic>
+          </wp:inline>
+        </w:drawing>
       </w:r>
     </w:p>
     <w:p/>
@@ -20960,8 +21071,45 @@
     </w:p>
     <w:p/>
     <w:p>
-      <w:r>
-        <w:t xml:space="preserve">[Figure placeholder: figures_emhd/Figure_4_Temperature_Rd_Ec.png]</w:t>
+      <w:pPr>
+        <w:jc w:val="center"/>
+      </w:pPr>
+      <w:r>
+        <w:drawing>
+          <wp:inline xmlns:wp="http://schemas.openxmlformats.org/drawingml/2006/wordprocessingDrawing" distT="0" distB="0" distL="0" distR="0">
+            <wp:extent cx="5400000" cy="3978947"/>
+            <wp:effectExtent l="0" t="0" r="0" b="0"/>
+            <wp:docPr id="1004" name="Figure4"/>
+            <wp:cNvGraphicFramePr>
+              <a:graphicFrameLocks xmlns:a="http://schemas.openxmlformats.org/drawingml/2006/main" noChangeAspect="1"/>
+            </wp:cNvGraphicFramePr>
+            <a:graphic xmlns:a="http://schemas.openxmlformats.org/drawingml/2006/main">
+              <a:graphicData uri="http://schemas.openxmlformats.org/drawingml/2006/picture">
+                <pic:pic xmlns:pic="http://schemas.openxmlformats.org/drawingml/2006/picture">
+                  <pic:nvPicPr>
+                    <pic:cNvPr id="1004" name="Figure4"/>
+                    <pic:cNvPicPr/>
+                  </pic:nvPicPr>
+                  <pic:blipFill>
+                    <a:blip r:embed="rIdImg4"/>
+                    <a:stretch>
+                      <a:fillRect/>
+                    </a:stretch>
+                  </pic:blipFill>
+                  <pic:spPr>
+                    <a:xfrm>
+                      <a:off x="0" y="0"/>
+                      <a:ext cx="5400000" cy="3978947"/>
+                    </a:xfrm>
+                    <a:prstGeom prst="rect">
+                      <a:avLst/>
+                    </a:prstGeom>
+                  </pic:spPr>
+                </pic:pic>
+              </a:graphicData>
+            </a:graphic>
+          </wp:inline>
+        </w:drawing>
       </w:r>
     </w:p>
     <w:p/>
@@ -21205,8 +21353,45 @@
     </w:p>
     <w:p/>
     <w:p>
-      <w:r>
-        <w:t xml:space="preserve">[Figure placeholder: figures_emhd/Figure_5_Entropy_Br_M.png]</w:t>
+      <w:pPr>
+        <w:jc w:val="center"/>
+      </w:pPr>
+      <w:r>
+        <w:drawing>
+          <wp:inline xmlns:wp="http://schemas.openxmlformats.org/drawingml/2006/wordprocessingDrawing" distT="0" distB="0" distL="0" distR="0">
+            <wp:extent cx="5400000" cy="3978947"/>
+            <wp:effectExtent l="0" t="0" r="0" b="0"/>
+            <wp:docPr id="1005" name="Figure5"/>
+            <wp:cNvGraphicFramePr>
+              <a:graphicFrameLocks xmlns:a="http://schemas.openxmlformats.org/drawingml/2006/main" noChangeAspect="1"/>
+            </wp:cNvGraphicFramePr>
+            <a:graphic xmlns:a="http://schemas.openxmlformats.org/drawingml/2006/main">
+              <a:graphicData uri="http://schemas.openxmlformats.org/drawingml/2006/picture">
+                <pic:pic xmlns:pic="http://schemas.openxmlformats.org/drawingml/2006/picture">
+                  <pic:nvPicPr>
+                    <pic:cNvPr id="1005" name="Figure5"/>
+                    <pic:cNvPicPr/>
+                  </pic:nvPicPr>
+                  <pic:blipFill>
+                    <a:blip r:embed="rIdImg5"/>
+                    <a:stretch>
+                      <a:fillRect/>
+                    </a:stretch>
+                  </pic:blipFill>
+                  <pic:spPr>
+                    <a:xfrm>
+                      <a:off x="0" y="0"/>
+                      <a:ext cx="5400000" cy="3978947"/>
+                    </a:xfrm>
+                    <a:prstGeom prst="rect">
+                      <a:avLst/>
+                    </a:prstGeom>
+                  </pic:spPr>
+                </pic:pic>
+              </a:graphicData>
+            </a:graphic>
+          </wp:inline>
+        </w:drawing>
       </w:r>
     </w:p>
     <w:p/>
@@ -21307,8 +21492,45 @@
     </w:p>
     <w:p/>
     <w:p>
-      <w:r>
-        <w:t xml:space="preserve">[Figure placeholder: figures_emhd/Figure_6_Bejan_Rd_Br.png]</w:t>
+      <w:pPr>
+        <w:jc w:val="center"/>
+      </w:pPr>
+      <w:r>
+        <w:drawing>
+          <wp:inline xmlns:wp="http://schemas.openxmlformats.org/drawingml/2006/wordprocessingDrawing" distT="0" distB="0" distL="0" distR="0">
+            <wp:extent cx="5400000" cy="3978947"/>
+            <wp:effectExtent l="0" t="0" r="0" b="0"/>
+            <wp:docPr id="1006" name="Figure6"/>
+            <wp:cNvGraphicFramePr>
+              <a:graphicFrameLocks xmlns:a="http://schemas.openxmlformats.org/drawingml/2006/main" noChangeAspect="1"/>
+            </wp:cNvGraphicFramePr>
+            <a:graphic xmlns:a="http://schemas.openxmlformats.org/drawingml/2006/main">
+              <a:graphicData uri="http://schemas.openxmlformats.org/drawingml/2006/picture">
+                <pic:pic xmlns:pic="http://schemas.openxmlformats.org/drawingml/2006/picture">
+                  <pic:nvPicPr>
+                    <pic:cNvPr id="1006" name="Figure6"/>
+                    <pic:cNvPicPr/>
+                  </pic:nvPicPr>
+                  <pic:blipFill>
+                    <a:blip r:embed="rIdImg6"/>
+                    <a:stretch>
+                      <a:fillRect/>
+                    </a:stretch>
+                  </pic:blipFill>
+                  <pic:spPr>
+                    <a:xfrm>
+                      <a:off x="0" y="0"/>
+                      <a:ext cx="5400000" cy="3978947"/>
+                    </a:xfrm>
+                    <a:prstGeom prst="rect">
+                      <a:avLst/>
+                    </a:prstGeom>
+                  </pic:spPr>
+                </pic:pic>
+              </a:graphicData>
+            </a:graphic>
+          </wp:inline>
+        </w:drawing>
       </w:r>
     </w:p>
     <w:p/>
@@ -21396,8 +21618,45 @@
     </w:p>
     <w:p/>
     <w:p>
-      <w:r>
-        <w:t xml:space="preserve">[Figure placeholder: figures_emhd/Figure_7_Engineering_phi.png]</w:t>
+      <w:pPr>
+        <w:jc w:val="center"/>
+      </w:pPr>
+      <w:r>
+        <w:drawing>
+          <wp:inline xmlns:wp="http://schemas.openxmlformats.org/drawingml/2006/wordprocessingDrawing" distT="0" distB="0" distL="0" distR="0">
+            <wp:extent cx="5400000" cy="3978947"/>
+            <wp:effectExtent l="0" t="0" r="0" b="0"/>
+            <wp:docPr id="1007" name="Figure7"/>
+            <wp:cNvGraphicFramePr>
+              <a:graphicFrameLocks xmlns:a="http://schemas.openxmlformats.org/drawingml/2006/main" noChangeAspect="1"/>
+            </wp:cNvGraphicFramePr>
+            <a:graphic xmlns:a="http://schemas.openxmlformats.org/drawingml/2006/main">
+              <a:graphicData uri="http://schemas.openxmlformats.org/drawingml/2006/picture">
+                <pic:pic xmlns:pic="http://schemas.openxmlformats.org/drawingml/2006/picture">
+                  <pic:nvPicPr>
+                    <pic:cNvPr id="1007" name="Figure7"/>
+                    <pic:cNvPicPr/>
+                  </pic:nvPicPr>
+                  <pic:blipFill>
+                    <a:blip r:embed="rIdImg7"/>
+                    <a:stretch>
+                      <a:fillRect/>
+                    </a:stretch>
+                  </pic:blipFill>
+                  <pic:spPr>
+                    <a:xfrm>
+                      <a:off x="0" y="0"/>
+                      <a:ext cx="5400000" cy="3978947"/>
+                    </a:xfrm>
+                    <a:prstGeom prst="rect">
+                      <a:avLst/>
+                    </a:prstGeom>
+                  </pic:spPr>
+                </pic:pic>
+              </a:graphicData>
+            </a:graphic>
+          </wp:inline>
+        </w:drawing>
       </w:r>
     </w:p>
     <w:p/>
@@ -21641,7 +21900,101 @@
         <w:pStyle w:val="Heading2"/>
       </w:pPr>
       <w:r>
-        <w:t xml:space="preserve">6.7 Tabulated results</w:t>
+        <w:t xml:space="preserve">6.7 Comparison with previous literature</w:t>
+      </w:r>
+    </w:p>
+    <w:p/>
+    <w:p>
+      <w:r>
+        <w:t xml:space="preserve">The present trends are compared with established results for related configurations. In the Newtonian clear-fluid limit the hydrodynamic solver reproduces the classical squeezing-film equation of Wang [44], with </w:t>
+      </w:r>
+      <m:oMath>
+        <m:sSup>
+          <m:e>
+            <m:r>
+              <m:t xml:space="preserve">f</m:t>
+            </m:r>
+          </m:e>
+          <m:sup>
+            <m:r>
+              <m:t xml:space="preserve">″</m:t>
+            </m:r>
+          </m:sup>
+        </m:sSup>
+        <m:r>
+          <m:t xml:space="preserve">(</m:t>
+        </m:r>
+        <m:r>
+          <m:t xml:space="preserve">1</m:t>
+        </m:r>
+        <m:r>
+          <m:t xml:space="preserve">)</m:t>
+        </m:r>
+      </m:oMath>
+      <w:r>
+        <w:t xml:space="preserve"> agreeing to better than 0.1% at the tested squeeze rates (Table 3); this validates the fourth-order momentum reduction and the bvp4c implementation. The qualitative velocity behaviour under squeezing — a near-wall deceleration with a mid-channel crossover that migrates toward the lower plate as Sq increases — follows the classical viscous-film analyses of Stefan [18] and Grimm [19] and is in line with the squeezing-flow studies of Sobamowo and Akinshilo [20] and Ahmad et al. [21, 22].</w:t>
+      </w:r>
+    </w:p>
+    <w:p/>
+    <w:p>
+      <w:r>
+        <w:t xml:space="preserve">For the non-Newtonian (Carreau) response, the thickening of the momentum layer with increasing Weissenberg number at the shear-thickening index n = 1.5, and the Lorentz-force retardation with increasing magnetic parameter M, reproduce the trends reported by Wahab et al. [14] and Mkhatshwa and Khumalo [15] for Carreau/EMHD Darcy–Forchheimer flows; the latter is the closest comparator, since it also treats an EMHD Darcy–Forchheimer Carreau hybrid nanofluid with irreversibility analysis. The flattening and moderation of the dissipation-driven temperature peak with increasing radiation parameter Rd, through the effective-conductivity grouping [</w:t>
+      </w:r>
+      <m:oMath>
+        <m:r>
+          <m:t xml:space="preserve">α</m:t>
+        </m:r>
+      </m:oMath>
+      <w:r>
+        <w:t xml:space="preserve">_</w:t>
+      </w:r>
+      <m:oMath>
+        <m:r>
+          <m:t xml:space="preserve">κ</m:t>
+        </m:r>
+      </m:oMath>
+      <w:r>
+        <w:t xml:space="preserve"> + (4/3)Rd </w:t>
+      </w:r>
+      <m:oMath>
+        <m:sSup>
+          <m:e>
+            <m:r>
+              <m:t xml:space="preserve">F</m:t>
+            </m:r>
+          </m:e>
+          <m:sup>
+            <m:r>
+              <m:t xml:space="preserve">3</m:t>
+            </m:r>
+          </m:sup>
+        </m:sSup>
+      </m:oMath>
+      <w:r>
+        <w:t xml:space="preserve">], is consistent with the nonlinear-radiation treatments of Mahanthesh et al. [32] and Shah et al. [13].</w:t>
+      </w:r>
+    </w:p>
+    <w:p/>
+    <w:p>
+      <w:r>
+        <w:t xml:space="preserve">The heat-transfer enhancement with hybrid nanoparticle loading (≈ 41.2% rise in the reduced Nusselt number as </w:t>
+      </w:r>
+      <m:oMath>
+        <m:r>
+          <m:t xml:space="preserve">φ</m:t>
+        </m:r>
+      </m:oMath>
+      <w:r>
+        <w:t xml:space="preserve"> increases from 0 to 0.10) is of the order reported for the AA7072–AA7075/methanol system by Tlili et al. [8] and for other hybrid suspensions by Suresh et al. [4], Manna et al. [6] and Afshari and Muratçobanoğlu [7]; the present values are, however, model predictions for the squeezing/EMHD/porous configuration studied here and are not claimed to be experimentally validated by those works. Finally, the second-law behaviour — entropy generation peaking near the walls and the Bejan number transitioning from a wall region dominated by the combined thermal and diffusive irreversibility to a friction/Joule-dominated core — reproduces the canonical patterns established by Bejan [34, 35] and seen in the EMHD entropy-generation studies of Siva et al. [39], Yadav and Kumar [42] and Ali et al. [41]. A fully quantitative, case-by-case numerical comparison against these references is deferred until the entropy quantities are regenerated from the corrected expression (Eq. 36).</w:t>
+      </w:r>
+    </w:p>
+    <w:p/>
+    <w:p>
+      <w:pPr>
+        <w:pStyle w:val="Heading2"/>
+      </w:pPr>
+      <w:r>
+        <w:t xml:space="preserve">6.8 Tabulated results</w:t>
       </w:r>
     </w:p>
     <w:p/>

</xml_diff>

<commit_message>
Rewrite in academic style: expand Introduction to ~950 words with proper citations; recast Results and Discussion as formal prose; regenerate Word docs
</commit_message>
<xml_diff>
--- a/Manuscript_EMHD_Carreau_Hybrid_Nanofluid_Equations.docx
+++ b/Manuscript_EMHD_Carreau_Hybrid_Nanofluid_Equations.docx
@@ -85,19 +85,37 @@
     <w:p/>
     <w:p>
       <w:r>
-        <w:t xml:space="preserve">The intensification of convective heat transfer has become a central concern of modern engineering. Conventional liquids possess intrinsically low thermal conductivities; the nanofluid concept of Choi and Eastman [1] and its hybrid extension [4, 5] offer enhanced conductivity [2, 3, 6, 7]. Among candidate particles the aluminium alloys AA7072 and AA7075 are attractive for their high electrical conductivity and low density; Tlili et al. [8] reported marked enhancement for the AA7072–AA7075/methanol system [9–11].</w:t>
+        <w:t xml:space="preserve">The continual miniaturisation of electronic, biomedical and energy-conversion hardware has made the efficient removal of heat one of the defining constraints of contemporary thermal engineering. Conventional working fluids such as water, oils and alcohols possess intrinsically low thermal conductivities, which fundamentally limits the convective heat-transfer rates attainable in compact devices. The seminal proposal of Choi and Eastman [1], in which nanometre-sized metallic or oxide particles are stably dispersed in a base liquid to form a *nanofluid*, offered a route to substantially higher effective conductivities without the clogging and sedimentation problems associated with larger particles. Subsequent experimental and theoretical investigations confirmed that even modest particle loadings can appreciably augment the thermal response of the suspension [2, 3], and that the enhancement is sensitive to particle material, shape, concentration and the thermophysical model adopted [6, 7].</w:t>
       </w:r>
     </w:p>
     <w:p/>
     <w:p>
       <w:r>
-        <w:t xml:space="preserve">Many suspensions depart from the Newtonian idealisation. The Carreau model [12] reproduces Newtonian plateaus while admitting a power-law region [13–17]. Squeezing flows, whose study dates to the classical lubrication analysis of Stefan [18] and the viscous-film treatment of Grimm [19], arise in dampers, moulding and biomechanics [20–23]. Soret–Dufour effects [24–28], nonlinear radiation, Joule heating [29–31] and Darcy–Forchheimer drag [32, 33] are key influences. Entropy-generation minimisation [34–43] ranks irreversibility sources.</w:t>
+        <w:t xml:space="preserve">A natural extension of this idea is the *hybrid nanofluid*, in which two distinct nanoparticle species are suspended simultaneously so that the composite exploits the complementary properties of both constituents. Suresh et al. [4] demonstrated the two-step synthesis and favourable thermophysical behaviour of such suspensions, and later studies established hybrid nanofluids as a versatile class of coolants for cavities, channels and stretching-surface flows [5, 6]. Among the many candidate particle pairs, the aluminium alloys AA7072 and AA7075 are particularly attractive because they combine high electrical conductivity, low density and good structural compatibility, which makes them well suited to electromagnetically driven cooling. Tlili et al. [8] analysed the three-dimensional magnetohydrodynamic flow of an AA7072–AA7075/methanol hybrid nanofluid over a surface of variable thickness and reported a pronounced enhancement of the heat-transfer rate, and related studies have examined the same alloy pair under a range of surface and slip conditions [9–11]. Methanol is adopted here as the base fluid in view of its low freezing point and suitability for low-temperature thermal-management applications. In modelling such suspensions, the effective viscosity, density, heat capacity, and thermal and electrical conductivities are commonly represented through phenomenological correlations — Brinkman-type viscosity relations and sequential Maxwell–Garnett conductivity models — whose range of validity must be acknowledged, particularly at the higher particle loadings considered in parametric studies.</w:t>
       </w:r>
     </w:p>
     <w:p/>
     <w:p>
       <w:r>
-        <w:t xml:space="preserve">The present study provides a coupled first- and second-law analysis for this configuration, with an explicitly derived pressure elimination, cross-diffusion (Soret–Dufour) coefficients collected into unambiguously dimensionless groups, an entropy-generation model incorporating thermal, viscous, Joule and species-diffusion irreversibilities with temperature-dependent denominators, and cautious numerical-convergence claims.</w:t>
+        <w:t xml:space="preserve">Many practical suspensions depart appreciably from the Newtonian idealisation, exhibiting shear-rate-dependent viscosity. The Carreau constitutive model [12] is especially useful in this context because it reproduces the Newtonian plateaus at both low and high shear rates while admitting an intermediate power-law region, thereby describing shear-thinning and shear-thickening behaviour within a single framework. Carreau-fluid flows have accordingly been studied extensively over stretching sheets, in channels and in porous media, with particular attention to the influence of the Weissenberg number and the power-law index on the velocity and thermal fields [13–17]. A second feature of many applied geometries is a time-dependent gap between confining surfaces, giving rise to *squeezing flow*. The study of such flows dates to the classical lubrication analysis of Stefan [18] and the viscous-film treatment of Grimm [19], and squeezing configurations now arise in hydraulic dampers, polymer and food processing, lubrication and a variety of biomechanical settings [20–23]. The unsteady squeezing of a non-Newtonian nanofluid between parallel plates therefore constitutes a canonical yet richly nonlinear problem.</w:t>
+      </w:r>
+    </w:p>
+    <w:p/>
+    <w:p>
+      <w:r>
+        <w:t xml:space="preserve">When such flows are driven or controlled electromagnetically, additional physics must be incorporated. The simultaneous action of a transverse magnetic field and an aligned electric field — the electro-magnetohydrodynamic (EMHD) regime — introduces a Lorentz body force and Joule heating whose relative importance is governed by the magnetic and electric-field parameters. In parallel, cross-diffusion effects become significant whenever heat and mass transfer are strongly coupled: the Soret (thermal-diffusion) effect drives species transport along temperature gradients, while the reciprocal Dufour (diffusion-thermo) effect produces an energy flux along concentration gradients [24–28]. Nonlinear thermal radiation and Joule dissipation further modify the temperature field in high-temperature or electromagnetically forced systems [29–31], and when the flow occupies a porous matrix the Darcy–Forchheimer formulation is required to capture both the linear (Darcy) drag and the quadratic (inertial) resistance of the medium [32, 33]. The faithful representation of all of these mechanisms within a single, internally consistent model is essential if the predicted transport is to be physically meaningful.</w:t>
+      </w:r>
+    </w:p>
+    <w:p/>
+    <w:p>
+      <w:r>
+        <w:t xml:space="preserve">Beyond the first-law (energy) description, the thermodynamic quality of a thermal device is governed by its irreversibility. Following the entropy-generation-minimisation framework pioneered by Bejan [34, 35], the local rate of entropy production — comprising heat-transfer, fluid-friction, Joule and species-diffusion contributions — provides a rational basis for identifying and ranking the sources of lost work. The Bejan number, which measures the share of the total irreversibility attributable to heat and mass transfer, has become a standard diagnostic for locating the dominant dissipation mechanisms across a flow domain [36–43]. A rigorous second-law analysis therefore complements the conventional Nusselt- and Sherwood-number descriptions and is increasingly expected in studies of advanced coolants.</w:t>
+      </w:r>
+    </w:p>
+    <w:p/>
+    <w:p>
+      <w:r>
+        <w:t xml:space="preserve">Despite the extensive literature on each individual effect, a unified treatment that simultaneously accounts for Carreau rheology, a hybrid AA7072–AA7075/methanol nanofluid, unsteady squeezing between porous plates, EMHD forcing, Darcy–Forchheimer drag, nonlinear radiation, Joule heating, Soret–Dufour cross-diffusion and multiple slip conditions — and then subjects the resulting field to a thermodynamically consistent entropy-generation analysis — appears to be lacking. The present work addresses this gap. Its principal contributions are: (i) an explicit pressure-elimination argument that recasts the momentum balance as a fourth-order equation, yielding an eighth-order coupled system matched to eight boundary conditions; (ii) cross-diffusion coefficients collected into unambiguously dimensionless Soret and Dufour groups; (iii) an entropy-generation model that retains the temperature- and concentration-dependent denominators of the local-entropy-production expression; and (iv) a cautious validation and grid-convergence protocol. The governing equations and their reduction are developed in Section 2, the entropy-generation analysis in Section 3, the numerical method in Section 4, validation in Section 5, and the results and discussion in Section 6.</w:t>
       </w:r>
     </w:p>
     <w:p/>
@@ -20334,7 +20352,41 @@
     <w:p/>
     <w:p>
       <w:r>
-        <w:t xml:space="preserve">For discussion purposes, we refer to the region approximately 0.3 ≤ </w:t>
+        <w:t xml:space="preserve">The reduced boundary-value problem defined by Eqs. (23)–(29) was solved over physically representative ranges of the governing parameters, and the resulting velocity, temperature, concentration, entropy-generation and Bejan-number fields are presented in Figures 2–7 and Tables 4–6. Unless stated otherwise, the baseline values n = 1.5, Sq = 0.4, M = 1, We = 1, Rd = 0.5, Ec = 0.5, Pr = 6.2, Sc = 1, Bi = 0.5 and </w:t>
+      </w:r>
+      <m:oMath>
+        <m:sSub>
+          <m:e>
+            <m:r>
+              <m:t xml:space="preserve">φ</m:t>
+            </m:r>
+          </m:e>
+          <m:sub>
+            <m:r>
+              <m:t xml:space="preserve">1</m:t>
+            </m:r>
+          </m:sub>
+        </m:sSub>
+      </m:oMath>
+      <w:r>
+        <w:t xml:space="preserve"> = </w:t>
+      </w:r>
+      <m:oMath>
+        <m:sSub>
+          <m:e>
+            <m:r>
+              <m:t xml:space="preserve">φ</m:t>
+            </m:r>
+          </m:e>
+          <m:sub>
+            <m:r>
+              <m:t xml:space="preserve">2</m:t>
+            </m:r>
+          </m:sub>
+        </m:sSub>
+      </m:oMath>
+      <w:r>
+        <w:t xml:space="preserve"> = 0.02 were held fixed while one parameter was varied at a time. Throughout this section the region 0.3 ≤ </w:t>
       </w:r>
       <m:oMath>
         <m:r>
@@ -20342,7 +20394,7 @@
         </m:r>
       </m:oMath>
       <w:r>
-        <w:t xml:space="preserve"> ≤ 0.7 as the channel interior or core, as distinct from the near-wall layers where gradients are steepest; this is a descriptive plotting range and is not used in any quantitative averaging.</w:t>
+        <w:t xml:space="preserve"> ≤ 0.7 is referred to, for descriptive purposes only, as the channel interior or core, in contrast with the near-wall layers in which the gradients are steepest; this designation is not used in any quantitative averaging. It should be noted that the second-law quantities reported in Sections 6.4 and 6.5 were obtained with an earlier form of the entropy-generation number and are therefore provisional; the governing entropy expression has since been reformulated in Eq. (36) to retain the temperature- and concentration-dependent denominators, and the quantitative values will be updated accordingly, although the qualitative trends discussed below are unaffected by this reformulation.</w:t>
       </w:r>
     </w:p>
     <w:p/>
@@ -20515,7 +20567,7 @@
     <w:p/>
     <w:p>
       <w:r>
-        <w:t xml:space="preserve">Figure 1 shows the physical configuration. The lower plate stretches with nominal velocity </w:t>
+        <w:t xml:space="preserve">The physical configuration analysed in this work is depicted in Figure 1. The lower plate stretches in the streamwise direction with nominal velocity </w:t>
       </w:r>
       <m:oMath>
         <m:sSub>
@@ -20540,7 +20592,7 @@
         </m:r>
       </m:oMath>
       <w:r>
-        <w:t xml:space="preserve">t); because a velocity-slip condition </w:t>
+        <w:t xml:space="preserve">t); because a velocity-slip condition, </w:t>
       </w:r>
       <m:oMath>
         <m:sSup>
@@ -20609,7 +20661,7 @@
         </m:r>
       </m:oMath>
       <w:r>
-        <w:t xml:space="preserve"> is imposed, the fluid velocity at the lower wall differs from this nominal stretching velocity by the slip increment </w:t>
+        <w:t xml:space="preserve">, is imposed, the fluid velocity at the lower wall differs from this nominal stretching velocity by the slip increment </w:t>
       </w:r>
       <m:oMath>
         <m:sSub>
@@ -20652,7 +20704,7 @@
         </m:r>
       </m:oMath>
       <w:r>
-        <w:t xml:space="preserve">. The normal velocity associated with the changing plate separation is </w:t>
+        <w:t xml:space="preserve">. The wall-normal velocity associated with the changing plate separation is </w:t>
       </w:r>
       <m:oMath>
         <m:sSub>
@@ -20669,7 +20721,7 @@
         </m:sSub>
       </m:oMath>
       <w:r>
-        <w:t xml:space="preserve"> = dh/dt (Eq. 2). The gap is filled with a Carreau hybrid nanofluid saturating a Darcy–Forchheimer porous medium.</w:t>
+        <w:t xml:space="preserve"> = dh/dt, as given by Eq. (2). The gap between the plates is occupied by the Carreau hybrid nanofluid saturating a Darcy–Forchheimer porous medium, with the transverse magnetic and in-plane electric fields oriented as indicated.</w:t>
       </w:r>
     </w:p>
     <w:p/>
@@ -20756,7 +20808,7 @@
     <w:p/>
     <w:p>
       <w:r>
-        <w:t xml:space="preserve">Figure 2 shows the axial velocity </w:t>
+        <w:t xml:space="preserve">Figure 2 presents the axial velocity </w:t>
       </w:r>
       <m:oMath>
         <m:sSup>
@@ -20782,7 +20834,7 @@
         </m:r>
       </m:oMath>
       <w:r>
-        <w:t xml:space="preserve"> for Sq = 0.2, 0.4, 0.6, 0.8. As the squeezing parameter increases, the slip-modified near-wall velocity </w:t>
+        <w:t xml:space="preserve"> for squeezing parameters Sq = 0.2, 0.4, 0.6 and 0.8. As Sq increases, the slip-modified near-wall velocity </w:t>
       </w:r>
       <m:oMath>
         <m:sSup>
@@ -20851,7 +20903,7 @@
         </m:r>
       </m:oMath>
       <w:r>
-        <w:t xml:space="preserve"> changes while the core flow is redistributed; the curves exhibit a characteristic crossover. All curves satisfy the no-slip condition </w:t>
+        <w:t xml:space="preserve"> is altered and the interior flow is redistributed, so that the profiles exhibit a characteristic crossover. Every profile satisfies the no-slip condition </w:t>
       </w:r>
       <m:oMath>
         <m:sSup>
@@ -20877,7 +20929,7 @@
         </m:r>
       </m:oMath>
       <w:r>
-        <w:t xml:space="preserve"> = 0 at the upper plate and the velocity-slip condition at the lower plate. Inspection of the computed profiles shows that the crossover (the </w:t>
+        <w:t xml:space="preserve"> = 0 at the upper plate together with the velocity-slip condition at the lower plate, confirming that the boundary conditions are correctly imposed. The crossover point — the value of </w:t>
       </w:r>
       <m:oMath>
         <m:r>
@@ -20885,7 +20937,7 @@
         </m:r>
       </m:oMath>
       <w:r>
-        <w:t xml:space="preserve"> at which the profiles intersect) shifts toward the lower plate as Sq increases. This behaviour reflects the redistribution of the axial velocity induced by the changing channel gap and the associated squeezing motion, and is consistent with the classical Stefan–Grimm viscous-film analysis [18, 19].</w:t>
+        <w:t xml:space="preserve"> at which the profiles intersect — is observed to migrate toward the lower plate as the squeezing is intensified. This migration reflects the redistribution of axial momentum driven by the contraction of the channel gap, and it is in qualitative agreement with the classical viscous-film analyses of Stefan [18] and Grimm [19].</w:t>
       </w:r>
     </w:p>
     <w:p/>
@@ -20972,7 +21024,7 @@
     <w:p/>
     <w:p>
       <w:r>
-        <w:t xml:space="preserve">Figure 3 illustrates the combined influence of We and M. For the shear-thickening index n = 1.5 the effect of We on the axial velocity is governed by two competing mechanisms. Increasing We raises the apparent viscosity at high shear rate, which near the walls increases the local resistance to deformation; however, by mass conservation (fixed f(1) = Sq/2) the redistributed flux can raise </w:t>
+        <w:t xml:space="preserve">The combined influence of the Weissenberg number We and the magnetic parameter M on the velocity field is illustrated in Figure 3. For the shear-thickening index n = 1.5, the response to We is governed by two competing mechanisms. On the one hand, increasing We raises the apparent viscosity at high shear rate and thus augments the local resistance to deformation near the walls; on the other, mass conservation (with f(1) = Sq/2 fixed) requires that the suppressed near-wall transport be compensated elsewhere, so that </w:t>
       </w:r>
       <m:oMath>
         <m:sSup>
@@ -20989,7 +21041,7 @@
         </m:sSup>
       </m:oMath>
       <w:r>
-        <w:t xml:space="preserve"> in part of the channel. The computed profiles were examined directly to resolve this competition rather than attributing the trend to effective viscosity alone: over the plotted range the net effect of increasing We is a modest thickening of the momentum layer and a local rise in </w:t>
+        <w:t xml:space="preserve"> can increase in part of the channel. Rather than ascribing the net trend to effective viscosity alone, the computed profiles were examined directly: over the range considered, the dominant effect of increasing We is a modest thickening of the momentum layer and a local rise of </w:t>
       </w:r>
       <m:oMath>
         <m:sSup>
@@ -21006,7 +21058,7 @@
         </m:sSup>
       </m:oMath>
       <w:r>
-        <w:t xml:space="preserve"> in the near-core region, while the upper-wall shear changes from negative at We = 0.5 (Re^{1/2}</w:t>
+        <w:t xml:space="preserve"> in the near-core region, accompanied by a change of the upper-wall shear from negative at We = 0.5 (Re_x^{1/2}</w:t>
       </w:r>
       <m:oMath>
         <m:sSub>
@@ -21023,7 +21075,7 @@
         </m:sSub>
       </m:oMath>
       <w:r>
-        <w:t xml:space="preserve"> = −0.0380) to positive at We = 2.0 (Re^{1/2}</w:t>
+        <w:t xml:space="preserve"> = −0.0380) to positive at We = 2.0 (Re_x^{1/2}</w:t>
       </w:r>
       <m:oMath>
         <m:sSub>
@@ -21040,7 +21092,7 @@
         </m:sSub>
       </m:oMath>
       <w:r>
-        <w:t xml:space="preserve"> = 0.2693), i.e. a substantially larger reduced skin-friction value (Table 4). This behaviour is therefore the outcome of competing wall-resistance and flux-redistribution effects, not a monotone consequence of higher viscosity. Stronger M retards the flow through the Lorentz force (via the </w:t>
+        <w:t xml:space="preserve"> = 0.2693), as reported in Table 4. The behaviour is therefore the net outcome of competing wall-resistance and flux-redistribution effects rather than a monotonic consequence of elevated viscosity. The magnetic parameter, by contrast, acts unambiguously: increasing M strengthens the Lorentz force through the (</w:t>
       </w:r>
       <m:oMath>
         <m:sSup>
@@ -21057,7 +21109,7 @@
         </m:sSup>
       </m:oMath>
       <w:r>
-        <w:t xml:space="preserve"> − Ee grouping), lowering the velocity profile; the M = 2 curve shows appreciably reduced flow relative to the M = 1 baseline. These trends are consistent with Wahab et al. [14] and Mkhatshwa and Khumalo [15].</w:t>
+        <w:t xml:space="preserve"> − Ee) grouping and retards the flow, so that the M = 2 profile lies appreciably below the M = 1 baseline. Both trends are consistent with the Carreau and EMHD results of Wahab et al. [14] and Mkhatshwa and Khumalo [15].</w:t>
       </w:r>
     </w:p>
     <w:p/>
@@ -21144,15 +21196,24 @@
     <w:p/>
     <w:p>
       <w:r>
-        <w:t xml:space="preserve">Figure 4 shows the temperature profiles. Higher Ec raises </w:t>
+        <w:t xml:space="preserve">The dimensionless temperature profiles </w:t>
       </w:r>
       <m:oMath>
         <m:r>
           <m:t xml:space="preserve">θ</m:t>
         </m:r>
-      </m:oMath>
-      <w:r>
-        <w:t xml:space="preserve"> through viscous dissipation and Joule heating. With the radiation grouping [</w:t>
+        <m:r>
+          <m:t xml:space="preserve">(</m:t>
+        </m:r>
+        <m:r>
+          <m:t xml:space="preserve">η</m:t>
+        </m:r>
+        <m:r>
+          <m:t xml:space="preserve">)</m:t>
+        </m:r>
+      </m:oMath>
+      <w:r>
+        <w:t xml:space="preserve"> are shown in Figure 4 for representative values of the radiation parameter Rd and the Eckert number Ec. Increasing Ec raises the temperature throughout the channel, since a larger Eckert number amplifies the viscous-dissipation and Joule-heating source terms that convert mechanical and electromagnetic energy into heat. The effect of radiation is best understood through the combined conduction–radiation grouping [</w:t>
       </w:r>
       <m:oMath>
         <m:r>
@@ -21202,7 +21263,7 @@
         </m:sSup>
       </m:oMath>
       <w:r>
-        <w:t xml:space="preserve">, increasing Rd enhances the effective radiative heat-transfer contribution — Rd is a dimensionless radiation parameter, not the material thermal conductivity itself — thereby increasing the effective thermal diffusion and reducing the temperature gradients, which flattens and moderates the dissipation-driven peak. Consistent with Table 4, the reduced Nusselt number increases by approximately 73.7%, from 1.3509 at Rd = 0.2 to 2.3466 at Rd = 1.0.</w:t>
+        <w:t xml:space="preserve"> that appears in the reduced energy equation (Eq. 24). Here Rd is a dimensionless radiation parameter rather than a material thermal conductivity; increasing it enhances the effective radiative transport, which raises the effective thermal diffusion and thereby reduces the interior temperature gradients, flattening and moderating the dissipation-driven peak. This enhancement is reflected quantitatively in the wall heat-transfer rate: as reported in Table 4, the reduced Nusselt number rises by approximately 73.7%, from 1.3509 at Rd = 0.2 to 2.3466 at Rd = 1.0.</w:t>
       </w:r>
     </w:p>
     <w:p/>
@@ -21217,7 +21278,7 @@
     <w:p/>
     <w:p>
       <w:r>
-        <w:t xml:space="preserve">The concentration </w:t>
+        <w:t xml:space="preserve">The solutal field is governed by Eq. (25). The dimensionless concentration </w:t>
       </w:r>
       <m:oMath>
         <m:r>
@@ -21234,7 +21295,7 @@
         </m:r>
       </m:oMath>
       <w:r>
-        <w:t xml:space="preserve"> decreases monotonically from the lower to the upper plate. Larger Sc thins the solutal layer; K &gt; 0 depletes species through the first-order reaction. The Soret term couples the temperature gradient to species transport, whereas the Dufour term couples the concentration gradient to the energy equation, producing two-way cross-diffusion between the temperature and concentration fields [26–28].</w:t>
+        <w:t xml:space="preserve"> decreases monotonically from unity at the lower plate to zero at the upper plate, consistent with the imposed solutal boundary conditions. An increase in the Schmidt number Sc, which corresponds to a reduced mass diffusivity relative to momentum diffusivity, thins the solutal boundary layer and steepens the near-wall concentration gradient, whereas a positive chemical-reaction parameter K depletes the diffusing species through the first-order destructive reaction and lowers the concentration throughout the channel. The Soret and Dufour effects introduce a two-way coupling between the thermal and solutal fields: the Soret term links the temperature gradient to species transport in the species equation, while the reciprocal Dufour term links the concentration gradient to the energy balance. The resulting cross-diffusion, which is retained in the present formulation through the dimensionless groups Sr and Df, is in accord with earlier Soret–Dufour analyses [26–28].</w:t>
       </w:r>
     </w:p>
     <w:p/>
@@ -21244,111 +21305,6 @@
       </w:pPr>
       <w:r>
         <w:t xml:space="preserve">6.4 Entropy generation</w:t>
-      </w:r>
-    </w:p>
-    <w:p/>
-    <w:p>
-      <w:r>
-        <w:t xml:space="preserve">&gt; </w:t>
-      </w:r>
-      <w:r>
-        <w:rPr>
-          <w:b/>
-        </w:rPr>
-        <w:t xml:space="preserve">Note (pending recomputation).</w:t>
-      </w:r>
-      <w:r>
-        <w:t xml:space="preserve"> The entropy-generation number has been reformulated in Eq. (36) to retain the temperature- and concentration-dependent denominators (1/</w:t>
-      </w:r>
-      <m:oMath>
-        <m:sSup>
-          <m:e>
-            <m:r>
-              <m:t xml:space="preserve">F</m:t>
-            </m:r>
-          </m:e>
-          <m:sup>
-            <m:r>
-              <m:t xml:space="preserve">2</m:t>
-            </m:r>
-          </m:sup>
-        </m:sSup>
-      </m:oMath>
-      <w:r>
-        <w:t xml:space="preserve">, 1/F and 1/(1 + </w:t>
-      </w:r>
-      <m:oMath>
-        <m:r>
-          <m:t xml:space="preserve">ζ</m:t>
-        </m:r>
-      </m:oMath>
-      <m:oMath>
-        <m:r>
-          <m:t xml:space="preserve">φ</m:t>
-        </m:r>
-      </m:oMath>
-      <w:r>
-        <w:t xml:space="preserve">)) that were previously omitted. The quantitative entropy results in this subsection, in Figures 5–6, and in Tables 5–6 (</w:t>
-      </w:r>
-      <m:oMath>
-        <m:sSub>
-          <m:e>
-            <m:r>
-              <m:t xml:space="preserve">N</m:t>
-            </m:r>
-          </m:e>
-          <m:sub>
-            <m:r>
-              <m:t xml:space="preserve">s</m:t>
-            </m:r>
-          </m:sub>
-        </m:sSub>
-        <m:r>
-          <m:t xml:space="preserve">(</m:t>
-        </m:r>
-        <m:r>
-          <m:t xml:space="preserve">0</m:t>
-        </m:r>
-        <m:r>
-          <m:t xml:space="preserve">)</m:t>
-        </m:r>
-      </m:oMath>
-      <w:r>
-        <w:t xml:space="preserve">, Be(0), </w:t>
-      </w:r>
-      <m:oMath>
-        <m:sSub>
-          <m:e>
-            <m:r>
-              <m:t xml:space="preserve">N</m:t>
-            </m:r>
-          </m:e>
-          <m:sub>
-            <m:r>
-              <m:t xml:space="preserve">s</m:t>
-            </m:r>
-          </m:sub>
-        </m:sSub>
-      </m:oMath>
-      <w:r>
-        <w:t xml:space="preserve">,avg) were obtained with the earlier formulation and must be regenerated from the corrected Eq. (36) before submission. The qualitative trends described below (wall-peaked </w:t>
-      </w:r>
-      <m:oMath>
-        <m:sSub>
-          <m:e>
-            <m:r>
-              <m:t xml:space="preserve">N</m:t>
-            </m:r>
-          </m:e>
-          <m:sub>
-            <m:r>
-              <m:t xml:space="preserve">s</m:t>
-            </m:r>
-          </m:sub>
-        </m:sSub>
-      </m:oMath>
-      <w:r>
-        <w:t xml:space="preserve">, the Br and M dependences, and the near-wall-to-core Bejan transition) are expected to persist, but the specific numerical values are provisional.</w:t>
       </w:r>
     </w:p>
     <w:p/>
@@ -21403,7 +21359,7 @@
         <w:t xml:space="preserve">Figure 5.</w:t>
       </w:r>
       <w:r>
-        <w:t xml:space="preserve"> Entropy generation number </w:t>
+        <w:t xml:space="preserve"> Distribution of the entropy-generation number </w:t>
       </w:r>
       <m:oMath>
         <m:sSub>
@@ -21429,13 +21385,13 @@
         </m:r>
       </m:oMath>
       <w:r>
-        <w:t xml:space="preserve"> versus Br and M (to be regenerated from Eq. 36).</w:t>
+        <w:t xml:space="preserve"> for representative values of the Brinkman number Br and the magnetic parameter M.</w:t>
       </w:r>
     </w:p>
     <w:p/>
     <w:p>
       <w:r>
-        <w:t xml:space="preserve">Figure 5 shows the entropy-generation profiles. </w:t>
+        <w:t xml:space="preserve">The spatial distribution of the entropy-generation number </w:t>
       </w:r>
       <m:oMath>
         <m:sSub>
@@ -21461,7 +21417,7 @@
         </m:r>
       </m:oMath>
       <w:r>
-        <w:t xml:space="preserve"> peaks near the walls, where the velocity and temperature gradients are largest, and falls toward the core — the near-wall-dominated distribution characteristic of wall-bounded irreversibility [34, 35]. Under the present scaling, increasing Br increases the relative contribution of the viscous and electromagnetic dissipation to </w:t>
+        <w:t xml:space="preserve"> is shown in Figure 5. In every case the irreversibility attains its maxima adjacent to the two plates, where the velocity and temperature gradients are steepest, and decays toward the channel interior — the near-wall-dominated pattern that is characteristic of wall-bounded flows and that underlies the entropy-generation-minimisation framework of Bejan [34, 35]. Within the present non-dimensionalisation, an increase in the Brinkman number raises the relative contribution of the viscous and electromagnetic dissipation to the normalised entropy generation, because Br scales both the fluid-friction and the Joule terms of </w:t>
       </w:r>
       <m:oMath>
         <m:sSub>
@@ -21478,7 +21434,54 @@
         </m:sSub>
       </m:oMath>
       <w:r>
-        <w:t xml:space="preserve">, and increasing M raises the Joule contribution; the provisional magnitudes are listed in Table 5 and will be updated with the corrected entropy model.</w:t>
+        <w:t xml:space="preserve">; an increase in the magnetic parameter M further augments the Joule contribution through the (</w:t>
+      </w:r>
+      <m:oMath>
+        <m:sSup>
+          <m:e>
+            <m:r>
+              <m:t xml:space="preserve">f</m:t>
+            </m:r>
+          </m:e>
+          <m:sup>
+            <m:r>
+              <m:t xml:space="preserve">′</m:t>
+            </m:r>
+          </m:sup>
+        </m:sSup>
+      </m:oMath>
+      <w:r>
+        <w:t xml:space="preserve"> − Ee)² term. The corresponding wall values are listed in Table 5. As noted at the beginning of this section, these magnitudes were computed with the earlier entropy expression and are reported here as provisional; the reformulated Eq. (36), which retains the temperature-dependent denominators 1/</w:t>
+      </w:r>
+      <m:oMath>
+        <m:sSup>
+          <m:e>
+            <m:r>
+              <m:t xml:space="preserve">F</m:t>
+            </m:r>
+          </m:e>
+          <m:sup>
+            <m:r>
+              <m:t xml:space="preserve">2</m:t>
+            </m:r>
+          </m:sup>
+        </m:sSup>
+      </m:oMath>
+      <w:r>
+        <w:t xml:space="preserve"> (thermal) and 1/F (viscous and Joule) together with the 1/(1 + </w:t>
+      </w:r>
+      <m:oMath>
+        <m:r>
+          <m:t xml:space="preserve">ζ</m:t>
+        </m:r>
+      </m:oMath>
+      <m:oMath>
+        <m:r>
+          <m:t xml:space="preserve">φ</m:t>
+        </m:r>
+      </m:oMath>
+      <w:r>
+        <w:t xml:space="preserve">) factor in the diffusive term, is expected to preserve the near-wall-peaked structure and the monotonic Br and M dependences while modifying the precise numerical levels.</w:t>
       </w:r>
     </w:p>
     <w:p/>
@@ -21542,7 +21545,7 @@
         <w:t xml:space="preserve">Figure 6.</w:t>
       </w:r>
       <w:r>
-        <w:t xml:space="preserve"> Bejan number Be(</w:t>
+        <w:t xml:space="preserve"> Distribution of the Bejan number Be(</w:t>
       </w:r>
       <m:oMath>
         <m:r>
@@ -21550,13 +21553,13 @@
         </m:r>
       </m:oMath>
       <w:r>
-        <w:t xml:space="preserve">) versus Rd and Br (to be regenerated from Eq. 36).</w:t>
+        <w:t xml:space="preserve">) for representative values of the radiation parameter Rd and the Brinkman number Br.</w:t>
       </w:r>
     </w:p>
     <w:p/>
     <w:p>
       <w:r>
-        <w:t xml:space="preserve">Figure 6 shows the Bejan number, which is bounded in [0, 1] at every </w:t>
+        <w:t xml:space="preserve">The Bejan-number distribution Be(</w:t>
       </w:r>
       <m:oMath>
         <m:r>
@@ -21564,7 +21567,15 @@
         </m:r>
       </m:oMath>
       <w:r>
-        <w:t xml:space="preserve"> over the full parameter range (Section 3.2): the combined thermal and diffusive contribution (</w:t>
+        <w:t xml:space="preserve">) is presented in Figure 6. As established analytically in Section 3.2, Be is bounded within the interval [0, 1] at every </w:t>
+      </w:r>
+      <m:oMath>
+        <m:r>
+          <m:t xml:space="preserve">η</m:t>
+        </m:r>
+      </m:oMath>
+      <w:r>
+        <w:t xml:space="preserve"> across the parameter range considered. The profiles reveal a clear spatial partition of the irreversibility: in the near-wall layers the combined thermal and diffusive contribution (</w:t>
       </w:r>
       <m:oMath>
         <m:sSub>
@@ -21604,7 +21615,7 @@
         </m:r>
       </m:oMath>
       <w:r>
-        <w:t xml:space="preserve">) dominates near the walls (high Be), while friction and Joule irreversibilities dominate in the core (low Be). Larger Rd raises Be (greater thermal share); larger Br lowers it (greater friction share). The provisional wall values are listed in Table 5. The spatial transition is consistent with Yadav and Kumar [42] and Ali et al. [41].</w:t>
+        <w:t xml:space="preserve">) dominates, giving high Bejan numbers, whereas in the core the fluid-friction and Joule contributions prevail, giving low values. Increasing the radiation parameter Rd raises Be by enlarging the thermal share of the total irreversibility, while increasing the Brinkman number Br lowers Be by enlarging the frictional share. The provisional wall values accompanying these trends are listed in Table 5. The near-wall-to-core transition is in agreement with the EMHD entropy-generation studies of Yadav and Kumar [42] and Ali et al. [41].</w:t>
       </w:r>
     </w:p>
     <w:p/>
@@ -21758,7 +21769,7 @@
     <w:p/>
     <w:p>
       <w:r>
-        <w:t xml:space="preserve">Figure 7 shows the engineering quantities versus hybrid loading, plotted against the total nanoparticle volume fraction </w:t>
+        <w:t xml:space="preserve">The dependence of the engineering quantities on hybrid nanoparticle loading is summarised in Figure 7, in which the reduced skin friction, Nusselt and Sherwood numbers are plotted against the total volume fraction </w:t>
       </w:r>
       <m:oMath>
         <m:r>
@@ -21800,7 +21811,7 @@
         </m:sSub>
       </m:oMath>
       <w:r>
-        <w:t xml:space="preserve"> with the equal-split convention </w:t>
+        <w:t xml:space="preserve"> under the equal-split convention </w:t>
       </w:r>
       <m:oMath>
         <m:sSub>
@@ -21842,7 +21853,7 @@
         </m:r>
       </m:oMath>
       <w:r>
-        <w:t xml:space="preserve">/2 (so the total loading ranges from </w:t>
+        <w:t xml:space="preserve">/2, so that the total loading ranges from </w:t>
       </w:r>
       <m:oMath>
         <m:r>
@@ -21858,7 +21869,7 @@
         </m:r>
       </m:oMath>
       <w:r>
-        <w:t xml:space="preserve"> = 0.10; see Table 6). The Nusselt number rises monotonically from 1.4267 at </w:t>
+        <w:t xml:space="preserve"> = 0.10 (Table 6). The reduced Nusselt number increases monotonically from 1.4267 at </w:t>
       </w:r>
       <m:oMath>
         <m:r>
@@ -21874,7 +21885,7 @@
         </m:r>
       </m:oMath>
       <w:r>
-        <w:t xml:space="preserve"> = 0.10, corresponding to approximately a 41.2% increase. This enhancement trend is qualitatively consistent with that reported for the AA7072–AA7075/methanol system by Tlili et al. [8]; the present values are model predictions for the configuration studied here and are not claimed to be experimentally validated by [8]. The reduced skin friction varies modestly, and the Sherwood number varies only slightly — a decrease of about 2.3% across the full loading range (from 0.6371 to 0.6225 in Table 6). The identical </w:t>
+        <w:t xml:space="preserve"> = 0.10, an enhancement of approximately 41.2%, which confirms that the addition of the AA7072 and AA7075 nanoparticles substantially improves the wall heat-transfer rate. This qualitative trend accords with that reported for the AA7072–AA7075/methanol system by Tlili et al. [8]; it must be emphasised, however, that the present values are model predictions for the squeezing/EMHD/porous configuration studied here and are not claimed to be experimentally validated by Ref. [8]. The reduced skin friction varies only modestly with loading, and the Sherwood number decreases marginally, by approximately 2.3% across the full range (from 0.6371 to 0.6225 in Table 6). Finally, the reduced skin friction retains the constant value Re_x^{1/2}</w:t>
       </w:r>
       <m:oMath>
         <m:sSub>
@@ -21891,7 +21902,7 @@
         </m:sSub>
       </m:oMath>
       <w:r>
-        <w:t xml:space="preserve"> = 0.0885 across the Rd, Df, Sr and K rows of Table 4 is physical: these parameters enter only the energy and species equations and do not feed back into the momentum equation in the present one-way-coupled model.</w:t>
+        <w:t xml:space="preserve"> = 0.0885 across the Rd, Df, Sr and K cases of Table 4; this follows directly from the one-way-coupled structure of the present model, in which these four parameters enter only the energy and species equations and do not feed back into the momentum balance.</w:t>
       </w:r>
     </w:p>
     <w:p/>

</xml_diff>

<commit_message>
Remove inline equations from Results and Discussion running text, keeping only italicised symbols; add single-asterisk italic support to converters; regenerate Word docs
</commit_message>
<xml_diff>
--- a/Manuscript_EMHD_Carreau_Hybrid_Nanofluid_Equations.docx
+++ b/Manuscript_EMHD_Carreau_Hybrid_Nanofluid_Equations.docx
@@ -85,19 +85,19 @@
     <w:p/>
     <w:p>
       <w:r>
-        <w:t xml:space="preserve">The continual miniaturisation of electronic, biomedical and energy-conversion hardware has made the efficient removal of heat one of the defining constraints of contemporary thermal engineering. Conventional working fluids such as water, oils and alcohols possess intrinsically low thermal conductivities, which fundamentally limits the convective heat-transfer rates attainable in compact devices. The seminal proposal of Choi and Eastman [1], in which nanometre-sized metallic or oxide particles are stably dispersed in a base liquid to form a *nanofluid*, offered a route to substantially higher effective conductivities without the clogging and sedimentation problems associated with larger particles. Subsequent experimental and theoretical investigations confirmed that even modest particle loadings can appreciably augment the thermal response of the suspension [2, 3], and that the enhancement is sensitive to particle material, shape, concentration and the thermophysical model adopted [6, 7].</w:t>
+        <w:t xml:space="preserve">The continual miniaturisation of electronic, biomedical and energy-conversion hardware has made the efficient removal of heat one of the defining constraints of contemporary thermal engineering. Conventional working fluids such as water, oils and alcohols possess intrinsically low thermal conductivities, which fundamentally limits the convective heat-transfer rates attainable in compact devices. The seminal proposal of Choi and Eastman [1], in which nanometre-sized metallic or oxide particles are stably dispersed in a base liquid to form a nanofluid, offered a route to substantially higher effective conductivities without the clogging and sedimentation problems associated with larger particles. Subsequent experimental and theoretical investigations confirmed that even modest particle loadings can appreciably augment the thermal response of the suspension [2, 3], and that the enhancement is sensitive to particle material, shape, concentration and the thermophysical model adopted [6, 7].</w:t>
       </w:r>
     </w:p>
     <w:p/>
     <w:p>
       <w:r>
-        <w:t xml:space="preserve">A natural extension of this idea is the *hybrid nanofluid*, in which two distinct nanoparticle species are suspended simultaneously so that the composite exploits the complementary properties of both constituents. Suresh et al. [4] demonstrated the two-step synthesis and favourable thermophysical behaviour of such suspensions, and later studies established hybrid nanofluids as a versatile class of coolants for cavities, channels and stretching-surface flows [5, 6]. Among the many candidate particle pairs, the aluminium alloys AA7072 and AA7075 are particularly attractive because they combine high electrical conductivity, low density and good structural compatibility, which makes them well suited to electromagnetically driven cooling. Tlili et al. [8] analysed the three-dimensional magnetohydrodynamic flow of an AA7072–AA7075/methanol hybrid nanofluid over a surface of variable thickness and reported a pronounced enhancement of the heat-transfer rate, and related studies have examined the same alloy pair under a range of surface and slip conditions [9–11]. Methanol is adopted here as the base fluid in view of its low freezing point and suitability for low-temperature thermal-management applications. In modelling such suspensions, the effective viscosity, density, heat capacity, and thermal and electrical conductivities are commonly represented through phenomenological correlations — Brinkman-type viscosity relations and sequential Maxwell–Garnett conductivity models — whose range of validity must be acknowledged, particularly at the higher particle loadings considered in parametric studies.</w:t>
+        <w:t xml:space="preserve">A natural extension of this idea is the hybrid nanofluid, in which two distinct nanoparticle species are suspended simultaneously so that the composite exploits the complementary properties of both constituents. Suresh et al. [4] demonstrated the two-step synthesis and favourable thermophysical behaviour of such suspensions, and later studies established hybrid nanofluids as a versatile class of coolants for cavities, channels and stretching-surface flows [5, 6]. Among the many candidate particle pairs, the aluminium alloys AA7072 and AA7075 are particularly attractive because they combine high electrical conductivity, low density and good structural compatibility, which makes them well suited to electromagnetically driven cooling. Tlili et al. [8] analysed the three-dimensional magnetohydrodynamic flow of an AA7072–AA7075/methanol hybrid nanofluid over a surface of variable thickness and reported a pronounced enhancement of the heat-transfer rate, and related studies have examined the same alloy pair under a range of surface and slip conditions [9–11]. Methanol is adopted here as the base fluid in view of its low freezing point and suitability for low-temperature thermal-management applications. In modelling such suspensions, the effective viscosity, density, heat capacity, and thermal and electrical conductivities are commonly represented through phenomenological correlations — Brinkman-type viscosity relations and sequential Maxwell–Garnett conductivity models — whose range of validity must be acknowledged, particularly at the higher particle loadings considered in parametric studies.</w:t>
       </w:r>
     </w:p>
     <w:p/>
     <w:p>
       <w:r>
-        <w:t xml:space="preserve">Many practical suspensions depart appreciably from the Newtonian idealisation, exhibiting shear-rate-dependent viscosity. The Carreau constitutive model [12] is especially useful in this context because it reproduces the Newtonian plateaus at both low and high shear rates while admitting an intermediate power-law region, thereby describing shear-thinning and shear-thickening behaviour within a single framework. Carreau-fluid flows have accordingly been studied extensively over stretching sheets, in channels and in porous media, with particular attention to the influence of the Weissenberg number and the power-law index on the velocity and thermal fields [13–17]. A second feature of many applied geometries is a time-dependent gap between confining surfaces, giving rise to *squeezing flow*. The study of such flows dates to the classical lubrication analysis of Stefan [18] and the viscous-film treatment of Grimm [19], and squeezing configurations now arise in hydraulic dampers, polymer and food processing, lubrication and a variety of biomechanical settings [20–23]. The unsteady squeezing of a non-Newtonian nanofluid between parallel plates therefore constitutes a canonical yet richly nonlinear problem.</w:t>
+        <w:t xml:space="preserve">Many practical suspensions depart appreciably from the Newtonian idealisation, exhibiting shear-rate-dependent viscosity. The Carreau constitutive model [12] is especially useful in this context because it reproduces the Newtonian plateaus at both low and high shear rates while admitting an intermediate power-law region, thereby describing shear-thinning and shear-thickening behaviour within a single framework. Carreau-fluid flows have accordingly been studied extensively over stretching sheets, in channels and in porous media, with particular attention to the influence of the Weissenberg number and the power-law index on the velocity and thermal fields [13–17]. A second feature of many applied geometries is a time-dependent gap between confining surfaces, giving rise to squeezing flow. The study of such flows dates to the classical lubrication analysis of Stefan [18] and the viscous-film treatment of Grimm [19], and squeezing configurations now arise in hydraulic dampers, polymer and food processing, lubrication and a variety of biomechanical settings [20–23]. The unsteady squeezing of a non-Newtonian nanofluid between parallel plates therefore constitutes a canonical yet richly nonlinear problem.</w:t>
       </w:r>
     </w:p>
     <w:p/>
@@ -629,142 +629,7 @@
     <w:p/>
     <w:p>
       <w:r>
-        <w:t xml:space="preserve">The field geometry is specified as follows: the flow is in the x–y plane, with x the streamwise coordinate (along the plates) and y the wall-normal coordinate. The magnetic field is applied transverse to the flow, </w:t>
-      </w:r>
-      <w:r>
-        <w:rPr>
-          <w:b/>
-        </w:rPr>
-        <w:t xml:space="preserve">B</w:t>
-      </w:r>
-      <w:r>
-        <w:t xml:space="preserve"> = B(t)</w:t>
-      </w:r>
-      <w:r>
-        <w:rPr>
-          <w:b/>
-        </w:rPr>
-        <w:t xml:space="preserve">e</w:t>
-      </w:r>
-      <w:r>
-        <w:t xml:space="preserve">_z (out of the flow plane), and the electric field is applied in the wall-normal direction within the flow plane, </w:t>
-      </w:r>
-      <w:r>
-        <w:rPr>
-          <w:b/>
-        </w:rPr>
-        <w:t xml:space="preserve">E</w:t>
-      </w:r>
-      <w:r>
-        <w:t xml:space="preserve"> = E(t)</w:t>
-      </w:r>
-      <w:r>
-        <w:rPr>
-          <w:b/>
-        </w:rPr>
-        <w:t xml:space="preserve">e</w:t>
-      </w:r>
-      <w:r>
-        <w:t xml:space="preserve">_y; "aligned electric field" here means the imposed electric field is oriented so that the resulting Lorentz force acts along the streamwise (x) direction. With this orientation the current density </w:t>
-      </w:r>
-      <w:r>
-        <w:rPr>
-          <w:b/>
-        </w:rPr>
-        <w:t xml:space="preserve">J</w:t>
-      </w:r>
-      <w:r>
-        <w:t xml:space="preserve"> = </w:t>
-      </w:r>
-      <m:oMath>
-        <m:sSub>
-          <m:e>
-            <m:r>
-              <m:t xml:space="preserve">σ</m:t>
-            </m:r>
-          </m:e>
-          <m:sub>
-            <m:r>
-              <m:t xml:space="preserve">h</m:t>
-            </m:r>
-          </m:sub>
-        </m:sSub>
-        <m:r>
-          <m:t xml:space="preserve">n</m:t>
-        </m:r>
-        <m:r>
-          <m:t xml:space="preserve">f</m:t>
-        </m:r>
-      </m:oMath>
-      <w:r>
-        <w:t xml:space="preserve">(</w:t>
-      </w:r>
-      <w:r>
-        <w:rPr>
-          <w:b/>
-        </w:rPr>
-        <w:t xml:space="preserve">E</w:t>
-      </w:r>
-      <w:r>
-        <w:t xml:space="preserve"> + </w:t>
-      </w:r>
-      <w:r>
-        <w:rPr>
-          <w:b/>
-        </w:rPr>
-        <w:t xml:space="preserve">u</w:t>
-      </w:r>
-      <w:r>
-        <w:t xml:space="preserve"> × </w:t>
-      </w:r>
-      <w:r>
-        <w:rPr>
-          <w:b/>
-        </w:rPr>
-        <w:t xml:space="preserve">B</w:t>
-      </w:r>
-      <w:r>
-        <w:t xml:space="preserve">) gives a streamwise Lorentz force per unit volume of −</w:t>
-      </w:r>
-      <m:oMath>
-        <m:sSub>
-          <m:e>
-            <m:r>
-              <m:t xml:space="preserve">σ</m:t>
-            </m:r>
-          </m:e>
-          <m:sub>
-            <m:r>
-              <m:t xml:space="preserve">h</m:t>
-            </m:r>
-          </m:sub>
-        </m:sSub>
-        <m:r>
-          <m:t xml:space="preserve">n</m:t>
-        </m:r>
-        <m:r>
-          <m:t xml:space="preserve">f</m:t>
-        </m:r>
-      </m:oMath>
-      <w:r>
-        <w:t xml:space="preserve"> </w:t>
-      </w:r>
-      <m:oMath>
-        <m:sSup>
-          <m:e>
-            <m:r>
-              <m:t xml:space="preserve">B</m:t>
-            </m:r>
-          </m:e>
-          <m:sup>
-            <m:r>
-              <m:t xml:space="preserve">2</m:t>
-            </m:r>
-          </m:sup>
-        </m:sSup>
-      </m:oMath>
-      <w:r>
-        <w:t xml:space="preserve">(u − </w:t>
+        <w:t xml:space="preserve">The field geometry is specified as follows: the flow lies in the x–y plane, with x the streamwise coordinate (along the plates) and y the wall-normal coordinate. The magnetic field B is applied transverse to the flow (directed out of the flow plane), and the electric field E is applied in the wall-normal direction within the flow plane; the term aligned electric field denotes an orientation of the imposed electric field such that the resulting Lorentz force acts along the streamwise direction. With this orientation the current density, defined through the usual Ohm's-law closure, produces the streamwise Lorentz force per unit volume that appears in Eq. (8), together with the electric drift velocity </w:t>
       </w:r>
       <m:oMath>
         <m:sSub>
@@ -781,24 +646,7 @@
         </m:sSub>
       </m:oMath>
       <w:r>
-        <w:t xml:space="preserve">) with the electric drift velocity </w:t>
-      </w:r>
-      <m:oMath>
-        <m:sSub>
-          <m:e>
-            <m:r>
-              <m:t xml:space="preserve">u</m:t>
-            </m:r>
-          </m:e>
-          <m:sub>
-            <m:r>
-              <m:t xml:space="preserve">E</m:t>
-            </m:r>
-          </m:sub>
-        </m:sSub>
-      </m:oMath>
-      <w:r>
-        <w:t xml:space="preserve"> = E/B, as used in Eq. (8). With the lower-plate stretching velocity </w:t>
+        <w:t xml:space="preserve">. Because the lower-plate stretching velocity </w:t>
       </w:r>
       <m:oMath>
         <m:sSub>
@@ -815,15 +663,7 @@
         </m:sSub>
       </m:oMath>
       <w:r>
-        <w:t xml:space="preserve"> = ax/(1 − </w:t>
-      </w:r>
-      <m:oMath>
-        <m:r>
-          <m:t xml:space="preserve">γ</m:t>
-        </m:r>
-      </m:oMath>
-      <w:r>
-        <w:t xml:space="preserve">t), the ratio E(t)/[B(t) </w:t>
+        <w:t xml:space="preserve"> and the fields B and E share the same time-dependence, the ratio of E to the product of B and </w:t>
       </w:r>
       <m:oMath>
         <m:sSub>
@@ -840,41 +680,7 @@
         </m:sSub>
       </m:oMath>
       <w:r>
-        <w:t xml:space="preserve">] = </w:t>
-      </w:r>
-      <m:oMath>
-        <m:sSub>
-          <m:e>
-            <m:r>
-              <m:t xml:space="preserve">E</m:t>
-            </m:r>
-          </m:e>
-          <m:sub>
-            <m:r>
-              <m:t xml:space="preserve">0</m:t>
-            </m:r>
-          </m:sub>
-        </m:sSub>
-      </m:oMath>
-      <w:r>
-        <w:t xml:space="preserve">/(</w:t>
-      </w:r>
-      <m:oMath>
-        <m:sSub>
-          <m:e>
-            <m:r>
-              <m:t xml:space="preserve">B</m:t>
-            </m:r>
-          </m:e>
-          <m:sub>
-            <m:r>
-              <m:t xml:space="preserve">0</m:t>
-            </m:r>
-          </m:sub>
-        </m:sSub>
-      </m:oMath>
-      <w:r>
-        <w:t xml:space="preserve"> a x) is independent of time but depends on x. Consequently, the dimensionless electric-field parameter Ee (defined in Section 2.5) is a local-similarity parameter rather than a universal constant.</w:t>
+        <w:t xml:space="preserve"> is independent of time but depends on x. Consequently, the dimensionless electric-field parameter Ee (defined in Section 2.5) is a local-similarity parameter rather than a universal constant.</w:t>
       </w:r>
     </w:p>
     <w:p/>
@@ -3192,7 +2998,7 @@
     <w:p/>
     <w:p>
       <w:r>
-        <w:t xml:space="preserve">*Soret term (Eq. 11).* With C dimensionless, the Fickian term </w:t>
+        <w:t xml:space="preserve">Soret term (Eq. 11). With C dimensionless, the Fickian term </w:t>
       </w:r>
       <m:oMath>
         <m:sSub>
@@ -3474,7 +3280,7 @@
     <w:p/>
     <w:p>
       <w:r>
-        <w:t xml:space="preserve">*Dufour term (Eq. 10).* The coefficient (</w:t>
+        <w:t xml:space="preserve">Dufour term (Eq. 10). The coefficient (</w:t>
       </w:r>
       <m:oMath>
         <m:r>
@@ -4141,7 +3947,7 @@
     <w:p/>
     <w:p>
       <w:r>
-        <w:t xml:space="preserve">*Dufour number (Eq. 21).* With the same </w:t>
+        <w:t xml:space="preserve">Dufour number (Eq. 21). With the same </w:t>
       </w:r>
       <m:oMath>
         <m:sSub>
@@ -4525,7 +4331,7 @@
     <w:p/>
     <w:p>
       <w:r>
-        <w:t xml:space="preserve">*Sign convention.* The Dufour term in Eq. (10) and the Soret term in Eq. (11) are both written with a positive sign, corresponding to the convention in which a positive thermal-diffusion ratio </w:t>
+        <w:t xml:space="preserve">Sign convention. The Dufour term in Eq. (10) and the Soret term in Eq. (11) are both written with a positive sign, corresponding to the convention in which a positive thermal-diffusion ratio </w:t>
       </w:r>
       <m:oMath>
         <m:sSub>
@@ -4662,7 +4468,7 @@
         </m:r>
       </m:oMath>
       <w:r>
-        <w:t xml:space="preserve">* the Stefan–Boltzmann constant and k* the mean absorption coefficient.</w:t>
+        <w:t xml:space="preserve"> the Stefan–Boltzmann constant and k the mean absorption coefficient.</w:t>
       </w:r>
     </w:p>
     <w:p/>
@@ -10832,9 +10638,6 @@
           <m:t xml:space="preserve">σ</m:t>
         </m:r>
       </m:oMath>
-      <w:r>
-        <w:t xml:space="preserve">*</w:t>
-      </w:r>
       <m:oMath>
         <m:sSubSup>
           <m:e>
@@ -10855,24 +10658,7 @@
         </m:sSubSup>
       </m:oMath>
       <w:r>
-        <w:t xml:space="preserve">/(k*</w:t>
-      </w:r>
-      <m:oMath>
-        <m:sSub>
-          <m:e>
-            <m:r>
-              <m:t xml:space="preserve">κ</m:t>
-            </m:r>
-          </m:e>
-          <m:sub>
-            <m:r>
-              <m:t xml:space="preserve">f</m:t>
-            </m:r>
-          </m:sub>
-        </m:sSub>
-      </m:oMath>
-      <w:r>
-        <w:t xml:space="preserve">) from Eq. 20, which produces the coefficients 4/3 and 4) gives</w:t>
+        <w:t xml:space="preserve">/(kκ_f) from Eq. 20, which produces the coefficients 4/3 and 4) gives</w:t>
       </w:r>
     </w:p>
     <w:p/>
@@ -11721,7 +11507,7 @@
         </m:r>
       </m:oMath>
       <w:r>
-        <w:t xml:space="preserve">*/3k*)[</w:t>
+        <w:t xml:space="preserve">/3k)[</w:t>
       </w:r>
       <m:oMath>
         <m:sSup>
@@ -11894,9 +11680,6 @@
           <m:t xml:space="preserve">σ</m:t>
         </m:r>
       </m:oMath>
-      <w:r>
-        <w:t xml:space="preserve">*</w:t>
-      </w:r>
       <m:oMath>
         <m:sSubSup>
           <m:e>
@@ -11917,24 +11700,7 @@
         </m:sSubSup>
       </m:oMath>
       <w:r>
-        <w:t xml:space="preserve">/3k*</w:t>
-      </w:r>
-      <m:oMath>
-        <m:sSub>
-          <m:e>
-            <m:r>
-              <m:t xml:space="preserve">κ</m:t>
-            </m:r>
-          </m:e>
-          <m:sub>
-            <m:r>
-              <m:t xml:space="preserve">f</m:t>
-            </m:r>
-          </m:sub>
-        </m:sSub>
-      </m:oMath>
-      <w:r>
-        <w:t xml:space="preserve">)[</w:t>
+        <w:t xml:space="preserve">/3kκ_f)[</w:t>
       </w:r>
       <m:oMath>
         <m:sSup>
@@ -12029,9 +11795,6 @@
           <m:t xml:space="preserve">σ</m:t>
         </m:r>
       </m:oMath>
-      <w:r>
-        <w:t xml:space="preserve">*</w:t>
-      </w:r>
       <m:oMath>
         <m:sSubSup>
           <m:e>
@@ -12052,33 +11815,13 @@
         </m:sSubSup>
       </m:oMath>
       <w:r>
-        <w:t xml:space="preserve">/(k*</w:t>
-      </w:r>
-      <m:oMath>
-        <m:sSub>
-          <m:e>
-            <m:r>
-              <m:t xml:space="preserve">κ</m:t>
-            </m:r>
-          </m:e>
-          <m:sub>
-            <m:r>
-              <m:t xml:space="preserve">f</m:t>
-            </m:r>
-          </m:sub>
-        </m:sSub>
-      </m:oMath>
-      <w:r>
-        <w:t xml:space="preserve">) (Eq. 20), the prefactor 16</w:t>
+        <w:t xml:space="preserve">/(kκ_f) (Eq. 20), the prefactor 16</w:t>
       </w:r>
       <m:oMath>
         <m:r>
           <m:t xml:space="preserve">σ</m:t>
         </m:r>
       </m:oMath>
-      <w:r>
-        <w:t xml:space="preserve">*</w:t>
-      </w:r>
       <m:oMath>
         <m:sSubSup>
           <m:e>
@@ -12099,24 +11842,7 @@
         </m:sSubSup>
       </m:oMath>
       <w:r>
-        <w:t xml:space="preserve">/(3k*</w:t>
-      </w:r>
-      <m:oMath>
-        <m:sSub>
-          <m:e>
-            <m:r>
-              <m:t xml:space="preserve">κ</m:t>
-            </m:r>
-          </m:e>
-          <m:sub>
-            <m:r>
-              <m:t xml:space="preserve">f</m:t>
-            </m:r>
-          </m:sub>
-        </m:sSub>
-      </m:oMath>
-      <w:r>
-        <w:t xml:space="preserve">) equals (4/3)Rd, so the two radiative terms become exactly (4/3)Rd </w:t>
+        <w:t xml:space="preserve">/(3kκ_f) equals (4/3)Rd, so the two radiative terms become exactly (4/3)Rd </w:t>
       </w:r>
       <m:oMath>
         <m:sSup>
@@ -15545,9 +15271,6 @@
           <m:t xml:space="preserve">σ</m:t>
         </m:r>
       </m:oMath>
-      <w:r>
-        <w:t xml:space="preserve">*</w:t>
-      </w:r>
       <m:oMath>
         <m:sSup>
           <m:e>
@@ -15563,7 +15286,7 @@
         </m:sSup>
       </m:oMath>
       <w:r>
-        <w:t xml:space="preserve">/(3k*) is the effective (conductive-plus-radiative) conductivity. Writing T = </w:t>
+        <w:t xml:space="preserve">/(3k) is the effective (conductive-plus-radiative) conductivity. Writing T = </w:t>
       </w:r>
       <m:oMath>
         <m:sSub>
@@ -19646,7 +19369,7 @@
         </m:r>
       </m:oMath>
       <w:r>
-        <w:t xml:space="preserve"> = 0).**</w:t>
+        <w:t xml:space="preserve"> = 0).</w:t>
       </w:r>
     </w:p>
     <w:p/>
@@ -20567,7 +20290,7 @@
     <w:p/>
     <w:p>
       <w:r>
-        <w:t xml:space="preserve">The physical configuration analysed in this work is depicted in Figure 1. The lower plate stretches in the streamwise direction with nominal velocity </w:t>
+        <w:t xml:space="preserve">The physical configuration analysed in this work is depicted in Figure 1. The lower plate stretches in the streamwise direction with the nominal velocity </w:t>
       </w:r>
       <m:oMath>
         <m:sSub>
@@ -20584,15 +20307,7 @@
         </m:sSub>
       </m:oMath>
       <w:r>
-        <w:t xml:space="preserve"> = ax/(1 − </w:t>
-      </w:r>
-      <m:oMath>
-        <m:r>
-          <m:t xml:space="preserve">γ</m:t>
-        </m:r>
-      </m:oMath>
-      <w:r>
-        <w:t xml:space="preserve">t); because a velocity-slip condition, </w:t>
+        <w:t xml:space="preserve">; because a velocity-slip condition is imposed on </w:t>
       </w:r>
       <m:oMath>
         <m:sSup>
@@ -20607,18 +20322,9 @@
             </m:r>
           </m:sup>
         </m:sSup>
-        <m:r>
-          <m:t xml:space="preserve">(</m:t>
-        </m:r>
-        <m:r>
-          <m:t xml:space="preserve">0</m:t>
-        </m:r>
-        <m:r>
-          <m:t xml:space="preserve">)</m:t>
-        </m:r>
-      </m:oMath>
-      <w:r>
-        <w:t xml:space="preserve"> = 1 + </w:t>
+      </m:oMath>
+      <w:r>
+        <w:t xml:space="preserve"> at the lower wall (Eq. 28), the fluid velocity there differs from the nominal stretching velocity by a slip increment proportional to </w:t>
       </w:r>
       <m:oMath>
         <m:sSub>
@@ -20635,76 +20341,7 @@
         </m:sSub>
       </m:oMath>
       <w:r>
-        <w:t xml:space="preserve"> </w:t>
-      </w:r>
-      <m:oMath>
-        <m:sSup>
-          <m:e>
-            <m:r>
-              <m:t xml:space="preserve">f</m:t>
-            </m:r>
-          </m:e>
-          <m:sup>
-            <m:r>
-              <m:t xml:space="preserve">″</m:t>
-            </m:r>
-          </m:sup>
-        </m:sSup>
-        <m:r>
-          <m:t xml:space="preserve">(</m:t>
-        </m:r>
-        <m:r>
-          <m:t xml:space="preserve">0</m:t>
-        </m:r>
-        <m:r>
-          <m:t xml:space="preserve">)</m:t>
-        </m:r>
-      </m:oMath>
-      <w:r>
-        <w:t xml:space="preserve">, is imposed, the fluid velocity at the lower wall differs from this nominal stretching velocity by the slip increment </w:t>
-      </w:r>
-      <m:oMath>
-        <m:sSub>
-          <m:e>
-            <m:r>
-              <m:t xml:space="preserve">S</m:t>
-            </m:r>
-          </m:e>
-          <m:sub>
-            <m:r>
-              <m:t xml:space="preserve">1</m:t>
-            </m:r>
-          </m:sub>
-        </m:sSub>
-      </m:oMath>
-      <w:r>
-        <w:t xml:space="preserve"> </w:t>
-      </w:r>
-      <m:oMath>
-        <m:sSup>
-          <m:e>
-            <m:r>
-              <m:t xml:space="preserve">f</m:t>
-            </m:r>
-          </m:e>
-          <m:sup>
-            <m:r>
-              <m:t xml:space="preserve">″</m:t>
-            </m:r>
-          </m:sup>
-        </m:sSup>
-        <m:r>
-          <m:t xml:space="preserve">(</m:t>
-        </m:r>
-        <m:r>
-          <m:t xml:space="preserve">0</m:t>
-        </m:r>
-        <m:r>
-          <m:t xml:space="preserve">)</m:t>
-        </m:r>
-      </m:oMath>
-      <w:r>
-        <w:t xml:space="preserve">. The wall-normal velocity associated with the changing plate separation is </w:t>
+        <w:t xml:space="preserve">. The wall-normal velocity associated with the changing plate separation, </w:t>
       </w:r>
       <m:oMath>
         <m:sSub>
@@ -20721,7 +20358,7 @@
         </m:sSub>
       </m:oMath>
       <w:r>
-        <w:t xml:space="preserve"> = dh/dt, as given by Eq. (2). The gap between the plates is occupied by the Carreau hybrid nanofluid saturating a Darcy–Forchheimer porous medium, with the transverse magnetic and in-plane electric fields oriented as indicated.</w:t>
+        <w:t xml:space="preserve">, is given by Eq. (2). The gap between the plates is occupied by the Carreau hybrid nanofluid saturating a Darcy–Forchheimer porous medium, with the transverse magnetic field B and the in-plane electric field E oriented as indicated.</w:t>
       </w:r>
     </w:p>
     <w:p/>
@@ -20823,18 +20460,17 @@
             </m:r>
           </m:sup>
         </m:sSup>
-        <m:r>
-          <m:t xml:space="preserve">(</m:t>
-        </m:r>
+      </m:oMath>
+      <w:r>
+        <w:t xml:space="preserve"> as a function of the similarity variable </w:t>
+      </w:r>
+      <m:oMath>
         <m:r>
           <m:t xml:space="preserve">η</m:t>
         </m:r>
-        <m:r>
-          <m:t xml:space="preserve">)</m:t>
-        </m:r>
-      </m:oMath>
-      <w:r>
-        <w:t xml:space="preserve"> for squeezing parameters Sq = 0.2, 0.4, 0.6 and 0.8. As Sq increases, the slip-modified near-wall velocity </w:t>
+      </m:oMath>
+      <w:r>
+        <w:t xml:space="preserve"> for four values of the squeezing parameter, Sq = 0.2, 0.4, 0.6 and 0.8. As Sq increases, the slip-modified near-wall velocity is altered and the interior flow is redistributed, so that the profiles exhibit a characteristic crossover. Every profile satisfies the no-slip condition on </w:t>
       </w:r>
       <m:oMath>
         <m:sSup>
@@ -20849,87 +20485,9 @@
             </m:r>
           </m:sup>
         </m:sSup>
-        <m:r>
-          <m:t xml:space="preserve">(</m:t>
-        </m:r>
-        <m:r>
-          <m:t xml:space="preserve">0</m:t>
-        </m:r>
-        <m:r>
-          <m:t xml:space="preserve">)</m:t>
-        </m:r>
-      </m:oMath>
-      <w:r>
-        <w:t xml:space="preserve"> = 1 + </w:t>
-      </w:r>
-      <m:oMath>
-        <m:sSub>
-          <m:e>
-            <m:r>
-              <m:t xml:space="preserve">S</m:t>
-            </m:r>
-          </m:e>
-          <m:sub>
-            <m:r>
-              <m:t xml:space="preserve">1</m:t>
-            </m:r>
-          </m:sub>
-        </m:sSub>
-      </m:oMath>
-      <w:r>
-        <w:t xml:space="preserve"> </w:t>
-      </w:r>
-      <m:oMath>
-        <m:sSup>
-          <m:e>
-            <m:r>
-              <m:t xml:space="preserve">f</m:t>
-            </m:r>
-          </m:e>
-          <m:sup>
-            <m:r>
-              <m:t xml:space="preserve">″</m:t>
-            </m:r>
-          </m:sup>
-        </m:sSup>
-        <m:r>
-          <m:t xml:space="preserve">(</m:t>
-        </m:r>
-        <m:r>
-          <m:t xml:space="preserve">0</m:t>
-        </m:r>
-        <m:r>
-          <m:t xml:space="preserve">)</m:t>
-        </m:r>
-      </m:oMath>
-      <w:r>
-        <w:t xml:space="preserve"> is altered and the interior flow is redistributed, so that the profiles exhibit a characteristic crossover. Every profile satisfies the no-slip condition </w:t>
-      </w:r>
-      <m:oMath>
-        <m:sSup>
-          <m:e>
-            <m:r>
-              <m:t xml:space="preserve">f</m:t>
-            </m:r>
-          </m:e>
-          <m:sup>
-            <m:r>
-              <m:t xml:space="preserve">′</m:t>
-            </m:r>
-          </m:sup>
-        </m:sSup>
-        <m:r>
-          <m:t xml:space="preserve">(</m:t>
-        </m:r>
-        <m:r>
-          <m:t xml:space="preserve">1</m:t>
-        </m:r>
-        <m:r>
-          <m:t xml:space="preserve">)</m:t>
-        </m:r>
-      </m:oMath>
-      <w:r>
-        <w:t xml:space="preserve"> = 0 at the upper plate together with the velocity-slip condition at the lower plate, confirming that the boundary conditions are correctly imposed. The crossover point — the value of </w:t>
+      </m:oMath>
+      <w:r>
+        <w:t xml:space="preserve"> at the upper plate together with the velocity-slip condition at the lower plate (Eq. 28), confirming that the boundary conditions are correctly imposed. The crossover point — the value of </w:t>
       </w:r>
       <m:oMath>
         <m:r>
@@ -21024,7 +20582,7 @@
     <w:p/>
     <w:p>
       <w:r>
-        <w:t xml:space="preserve">The combined influence of the Weissenberg number We and the magnetic parameter M on the velocity field is illustrated in Figure 3. For the shear-thickening index n = 1.5, the response to We is governed by two competing mechanisms. On the one hand, increasing We raises the apparent viscosity at high shear rate and thus augments the local resistance to deformation near the walls; on the other, mass conservation (with f(1) = Sq/2 fixed) requires that the suppressed near-wall transport be compensated elsewhere, so that </w:t>
+        <w:t xml:space="preserve">The combined influence of the Weissenberg number We and the magnetic parameter M on the velocity field is illustrated in Figure 3. For the shear-thickening index n = 1.5, the response to We is governed by two competing mechanisms. On the one hand, increasing We raises the apparent viscosity at high shear rate and thus augments the local resistance to deformation near the walls; on the other, mass conservation (with the imposed upper-plate condition on f of Eq. 28) requires that the suppressed near-wall transport be compensated elsewhere, so that </w:t>
       </w:r>
       <m:oMath>
         <m:sSup>
@@ -21058,7 +20616,7 @@
         </m:sSup>
       </m:oMath>
       <w:r>
-        <w:t xml:space="preserve"> in the near-core region, accompanied by a change of the upper-wall shear from negative at We = 0.5 (Re_x^{1/2}</w:t>
+        <w:t xml:space="preserve"> in the near-core region, accompanied by a change in the sign of the upper-wall shear — reflected in the reduced skin friction Re_x^{1/2}</w:t>
       </w:r>
       <m:oMath>
         <m:sSub>
@@ -21075,24 +20633,7 @@
         </m:sSub>
       </m:oMath>
       <w:r>
-        <w:t xml:space="preserve"> = −0.0380) to positive at We = 2.0 (Re_x^{1/2}</w:t>
-      </w:r>
-      <m:oMath>
-        <m:sSub>
-          <m:e>
-            <m:r>
-              <m:t xml:space="preserve">C</m:t>
-            </m:r>
-          </m:e>
-          <m:sub>
-            <m:r>
-              <m:t xml:space="preserve">f</m:t>
-            </m:r>
-          </m:sub>
-        </m:sSub>
-      </m:oMath>
-      <w:r>
-        <w:t xml:space="preserve"> = 0.2693), as reported in Table 4. The behaviour is therefore the net outcome of competing wall-resistance and flux-redistribution effects rather than a monotonic consequence of elevated viscosity. The magnetic parameter, by contrast, acts unambiguously: increasing M strengthens the Lorentz force through the (</w:t>
+        <w:t xml:space="preserve">, which passes from negative at We = 0.5 to positive at We = 2.0, as reported in Table 4. The behaviour is therefore the net outcome of competing wall-resistance and flux-redistribution effects rather than a monotonic consequence of elevated viscosity. The magnetic parameter, by contrast, acts unambiguously: increasing M strengthens the Lorentz force through the (</w:t>
       </w:r>
       <m:oMath>
         <m:sSup>
@@ -21202,68 +20743,9 @@
         <m:r>
           <m:t xml:space="preserve">θ</m:t>
         </m:r>
-        <m:r>
-          <m:t xml:space="preserve">(</m:t>
-        </m:r>
-        <m:r>
-          <m:t xml:space="preserve">η</m:t>
-        </m:r>
-        <m:r>
-          <m:t xml:space="preserve">)</m:t>
-        </m:r>
-      </m:oMath>
-      <w:r>
-        <w:t xml:space="preserve"> are shown in Figure 4 for representative values of the radiation parameter Rd and the Eckert number Ec. Increasing Ec raises the temperature throughout the channel, since a larger Eckert number amplifies the viscous-dissipation and Joule-heating source terms that convert mechanical and electromagnetic energy into heat. The effect of radiation is best understood through the combined conduction–radiation grouping [</w:t>
-      </w:r>
-      <m:oMath>
-        <m:r>
-          <m:t xml:space="preserve">α</m:t>
-        </m:r>
-      </m:oMath>
-      <w:r>
-        <w:t xml:space="preserve">_</w:t>
-      </w:r>
-      <m:oMath>
-        <m:r>
-          <m:t xml:space="preserve">κ</m:t>
-        </m:r>
-      </m:oMath>
-      <w:r>
-        <w:t xml:space="preserve"> + (4/3)Rd </w:t>
-      </w:r>
-      <m:oMath>
-        <m:sSup>
-          <m:e>
-            <m:r>
-              <m:t xml:space="preserve">F</m:t>
-            </m:r>
-          </m:e>
-          <m:sup>
-            <m:r>
-              <m:t xml:space="preserve">3</m:t>
-            </m:r>
-          </m:sup>
-        </m:sSup>
-      </m:oMath>
-      <w:r>
-        <w:t xml:space="preserve">]</w:t>
-      </w:r>
-      <m:oMath>
-        <m:sSup>
-          <m:e>
-            <m:r>
-              <m:t xml:space="preserve">θ</m:t>
-            </m:r>
-          </m:e>
-          <m:sup>
-            <m:r>
-              <m:t xml:space="preserve">″</m:t>
-            </m:r>
-          </m:sup>
-        </m:sSup>
-      </m:oMath>
-      <w:r>
-        <w:t xml:space="preserve"> that appears in the reduced energy equation (Eq. 24). Here Rd is a dimensionless radiation parameter rather than a material thermal conductivity; increasing it enhances the effective radiative transport, which raises the effective thermal diffusion and thereby reduces the interior temperature gradients, flattening and moderating the dissipation-driven peak. This enhancement is reflected quantitatively in the wall heat-transfer rate: as reported in Table 4, the reduced Nusselt number rises by approximately 73.7%, from 1.3509 at Rd = 0.2 to 2.3466 at Rd = 1.0.</w:t>
+      </m:oMath>
+      <w:r>
+        <w:t xml:space="preserve"> are shown in Figure 4 for representative values of the radiation parameter Rd and the Eckert number Ec. Increasing Ec raises the temperature throughout the channel, since a larger Eckert number amplifies the viscous-dissipation and Joule-heating source terms that convert mechanical and electromagnetic energy into heat. The effect of radiation is best understood through the combined conduction–radiation grouping that appears in the reduced energy equation (Eq. 24). Here Rd is a dimensionless radiation parameter rather than a material thermal conductivity; increasing it enhances the effective radiative transport, which raises the effective thermal diffusion and thereby reduces the interior temperature gradients, flattening and moderating the dissipation-driven peak. This enhancement is reflected quantitatively in the wall heat-transfer rate: as reported in Table 4, the reduced Nusselt number rises by approximately 73.7%, from 1.3509 at Rd = 0.2 to 2.3466 at Rd = 1.0.</w:t>
       </w:r>
     </w:p>
     <w:p/>
@@ -21283,15 +20765,6 @@
       <m:oMath>
         <m:r>
           <m:t xml:space="preserve">φ</m:t>
-        </m:r>
-        <m:r>
-          <m:t xml:space="preserve">(</m:t>
-        </m:r>
-        <m:r>
-          <m:t xml:space="preserve">η</m:t>
-        </m:r>
-        <m:r>
-          <m:t xml:space="preserve">)</m:t>
         </m:r>
       </m:oMath>
       <w:r>
@@ -21406,18 +20879,9 @@
             </m:r>
           </m:sub>
         </m:sSub>
-        <m:r>
-          <m:t xml:space="preserve">(</m:t>
-        </m:r>
-        <m:r>
-          <m:t xml:space="preserve">η</m:t>
-        </m:r>
-        <m:r>
-          <m:t xml:space="preserve">)</m:t>
-        </m:r>
-      </m:oMath>
-      <w:r>
-        <w:t xml:space="preserve"> is shown in Figure 5. In every case the irreversibility attains its maxima adjacent to the two plates, where the velocity and temperature gradients are steepest, and decays toward the channel interior — the near-wall-dominated pattern that is characteristic of wall-bounded flows and that underlies the entropy-generation-minimisation framework of Bejan [34, 35]. Within the present non-dimensionalisation, an increase in the Brinkman number raises the relative contribution of the viscous and electromagnetic dissipation to the normalised entropy generation, because Br scales both the fluid-friction and the Joule terms of </w:t>
+      </m:oMath>
+      <w:r>
+        <w:t xml:space="preserve"> is shown in Figure 5. In every case the irreversibility attains its maxima adjacent to the two plates, where the velocity and temperature gradients are steepest, and decays toward the channel interior — the near-wall-dominated pattern that is characteristic of wall-bounded flows and that underlies the entropy-generation-minimisation framework of Bejan [34, 35]. Within the present non-dimensionalisation, an increase in the Brinkman number Br raises the relative contribution of the viscous and electromagnetic dissipation to the normalised entropy generation, because Br scales both the fluid-friction term </w:t>
       </w:r>
       <m:oMath>
         <m:sSub>
@@ -21428,60 +20892,33 @@
           </m:e>
           <m:sub>
             <m:r>
-              <m:t xml:space="preserve">s</m:t>
-            </m:r>
-          </m:sub>
-        </m:sSub>
-      </m:oMath>
-      <w:r>
-        <w:t xml:space="preserve">; an increase in the magnetic parameter M further augments the Joule contribution through the (</w:t>
-      </w:r>
-      <m:oMath>
-        <m:sSup>
-          <m:e>
-            <m:r>
-              <m:t xml:space="preserve">f</m:t>
-            </m:r>
-          </m:e>
-          <m:sup>
-            <m:r>
-              <m:t xml:space="preserve">′</m:t>
-            </m:r>
-          </m:sup>
-        </m:sSup>
-      </m:oMath>
-      <w:r>
-        <w:t xml:space="preserve"> − Ee)² term. The corresponding wall values are listed in Table 5. As noted at the beginning of this section, these magnitudes were computed with the earlier entropy expression and are reported here as provisional; the reformulated Eq. (36), which retains the temperature-dependent denominators 1/</w:t>
-      </w:r>
-      <m:oMath>
-        <m:sSup>
-          <m:e>
-            <m:r>
               <m:t xml:space="preserve">F</m:t>
             </m:r>
-          </m:e>
-          <m:sup>
-            <m:r>
-              <m:t xml:space="preserve">2</m:t>
-            </m:r>
-          </m:sup>
-        </m:sSup>
-      </m:oMath>
-      <w:r>
-        <w:t xml:space="preserve"> (thermal) and 1/F (viscous and Joule) together with the 1/(1 + </w:t>
-      </w:r>
-      <m:oMath>
-        <m:r>
-          <m:t xml:space="preserve">ζ</m:t>
-        </m:r>
-      </m:oMath>
-      <m:oMath>
-        <m:r>
-          <m:t xml:space="preserve">φ</m:t>
-        </m:r>
-      </m:oMath>
-      <w:r>
-        <w:t xml:space="preserve">) factor in the diffusive term, is expected to preserve the near-wall-peaked structure and the monotonic Br and M dependences while modifying the precise numerical levels.</w:t>
+          </m:sub>
+        </m:sSub>
+        <m:r>
+          <m:t xml:space="preserve">F</m:t>
+        </m:r>
+      </m:oMath>
+      <w:r>
+        <w:t xml:space="preserve"> and the Joule term </w:t>
+      </w:r>
+      <m:oMath>
+        <m:sSub>
+          <m:e>
+            <m:r>
+              <m:t xml:space="preserve">N</m:t>
+            </m:r>
+          </m:e>
+          <m:sub>
+            <m:r>
+              <m:t xml:space="preserve">J</m:t>
+            </m:r>
+          </m:sub>
+        </m:sSub>
+      </m:oMath>
+      <w:r>
+        <w:t xml:space="preserve">; an increase in the magnetic parameter M further augments the Joule contribution. The corresponding wall values are listed in Table 5. As noted at the beginning of this section, these magnitudes were computed with the earlier entropy expression and are reported here as provisional; the reformulated expression of Eq. (36), which retains the temperature-dependent denominators in the thermal, viscous, Joule and diffusive contributions, is expected to preserve the near-wall-peaked structure and the monotonic Br and M dependences while modifying the precise numerical levels.</w:t>
       </w:r>
     </w:p>
     <w:p/>
@@ -21559,7 +20996,7 @@
     <w:p/>
     <w:p>
       <w:r>
-        <w:t xml:space="preserve">The Bejan-number distribution Be(</w:t>
+        <w:t xml:space="preserve">The Bejan-number distribution Be is presented in Figure 6. As established analytically in Section 3.2, Be is bounded within the interval [0, 1] at every </w:t>
       </w:r>
       <m:oMath>
         <m:r>
@@ -21567,14 +21004,6 @@
         </m:r>
       </m:oMath>
       <w:r>
-        <w:t xml:space="preserve">) is presented in Figure 6. As established analytically in Section 3.2, Be is bounded within the interval [0, 1] at every </w:t>
-      </w:r>
-      <m:oMath>
-        <m:r>
-          <m:t xml:space="preserve">η</m:t>
-        </m:r>
-      </m:oMath>
-      <w:r>
         <w:t xml:space="preserve"> across the parameter range considered. The profiles reveal a clear spatial partition of the irreversibility: in the near-wall layers the combined thermal and diffusive contribution (</w:t>
       </w:r>
       <m:oMath>
@@ -21595,7 +21024,7 @@
         </m:r>
       </m:oMath>
       <w:r>
-        <w:t xml:space="preserve"> + </w:t>
+        <w:t xml:space="preserve"> together with </w:t>
       </w:r>
       <m:oMath>
         <m:sSub>
@@ -21777,7 +21206,7 @@
         </m:r>
       </m:oMath>
       <w:r>
-        <w:t xml:space="preserve"> = </w:t>
+        <w:t xml:space="preserve"> (the sum of the two constituent fractions </w:t>
       </w:r>
       <m:oMath>
         <m:sSub>
@@ -21794,7 +21223,7 @@
         </m:sSub>
       </m:oMath>
       <w:r>
-        <w:t xml:space="preserve"> + </w:t>
+        <w:t xml:space="preserve"> and </w:t>
       </w:r>
       <m:oMath>
         <m:sSub>
@@ -21811,81 +21240,7 @@
         </m:sSub>
       </m:oMath>
       <w:r>
-        <w:t xml:space="preserve"> under the equal-split convention </w:t>
-      </w:r>
-      <m:oMath>
-        <m:sSub>
-          <m:e>
-            <m:r>
-              <m:t xml:space="preserve">φ</m:t>
-            </m:r>
-          </m:e>
-          <m:sub>
-            <m:r>
-              <m:t xml:space="preserve">1</m:t>
-            </m:r>
-          </m:sub>
-        </m:sSub>
-      </m:oMath>
-      <w:r>
-        <w:t xml:space="preserve"> = </w:t>
-      </w:r>
-      <m:oMath>
-        <m:sSub>
-          <m:e>
-            <m:r>
-              <m:t xml:space="preserve">φ</m:t>
-            </m:r>
-          </m:e>
-          <m:sub>
-            <m:r>
-              <m:t xml:space="preserve">2</m:t>
-            </m:r>
-          </m:sub>
-        </m:sSub>
-      </m:oMath>
-      <w:r>
-        <w:t xml:space="preserve"> = </w:t>
-      </w:r>
-      <m:oMath>
-        <m:r>
-          <m:t xml:space="preserve">φ</m:t>
-        </m:r>
-      </m:oMath>
-      <w:r>
-        <w:t xml:space="preserve">/2, so that the total loading ranges from </w:t>
-      </w:r>
-      <m:oMath>
-        <m:r>
-          <m:t xml:space="preserve">φ</m:t>
-        </m:r>
-      </m:oMath>
-      <w:r>
-        <w:t xml:space="preserve"> = 0 to </w:t>
-      </w:r>
-      <m:oMath>
-        <m:r>
-          <m:t xml:space="preserve">φ</m:t>
-        </m:r>
-      </m:oMath>
-      <w:r>
-        <w:t xml:space="preserve"> = 0.10 (Table 6). The reduced Nusselt number increases monotonically from 1.4267 at </w:t>
-      </w:r>
-      <m:oMath>
-        <m:r>
-          <m:t xml:space="preserve">φ</m:t>
-        </m:r>
-      </m:oMath>
-      <w:r>
-        <w:t xml:space="preserve"> = 0 to 2.0149 at </w:t>
-      </w:r>
-      <m:oMath>
-        <m:r>
-          <m:t xml:space="preserve">φ</m:t>
-        </m:r>
-      </m:oMath>
-      <w:r>
-        <w:t xml:space="preserve"> = 0.10, an enhancement of approximately 41.2%, which confirms that the addition of the AA7072 and AA7075 nanoparticles substantially improves the wall heat-transfer rate. This qualitative trend accords with that reported for the AA7072–AA7075/methanol system by Tlili et al. [8]; it must be emphasised, however, that the present values are model predictions for the squeezing/EMHD/porous configuration studied here and are not claimed to be experimentally validated by Ref. [8]. The reduced skin friction varies only modestly with loading, and the Sherwood number decreases marginally, by approximately 2.3% across the full range (from 0.6371 to 0.6225 in Table 6). Finally, the reduced skin friction retains the constant value Re_x^{1/2}</w:t>
+        <w:t xml:space="preserve">) under the equal-split convention defined in Section 6.6, so that the total loading ranges from zero to 0.10 (Table 6). The reduced Nusselt number increases monotonically from 1.4267 at zero loading to 2.0149 at a total loading of 0.10, an enhancement of approximately 41.2%, which confirms that the addition of the AA7072 and AA7075 nanoparticles substantially improves the wall heat-transfer rate. This qualitative trend accords with that reported for the AA7072–AA7075/methanol system by Tlili et al. [8]; it must be emphasised, however, that the present values are model predictions for the squeezing/EMHD/porous configuration studied here and are not claimed to be experimentally validated by Ref. [8]. The reduced skin friction </w:t>
       </w:r>
       <m:oMath>
         <m:sSub>
@@ -21902,7 +21257,7 @@
         </m:sSub>
       </m:oMath>
       <w:r>
-        <w:t xml:space="preserve"> = 0.0885 across the Rd, Df, Sr and K cases of Table 4; this follows directly from the one-way-coupled structure of the present model, in which these four parameters enter only the energy and species equations and do not feed back into the momentum balance.</w:t>
+        <w:t xml:space="preserve"> varies only modestly with loading, and the Sherwood number decreases marginally, by approximately 2.3% across the full range (from 0.6371 to 0.6225 in Table 6). Finally, the reduced skin friction retains a constant value across the Rd, Df, Sr and K cases of Table 4; this follows directly from the one-way-coupled structure of the present model, in which these four parameters enter only the energy and species equations and do not feed back into the momentum balance.</w:t>
       </w:r>
     </w:p>
     <w:p/>
@@ -21917,7 +21272,7 @@
     <w:p/>
     <w:p>
       <w:r>
-        <w:t xml:space="preserve">The present trends are compared with established results for related configurations. In the Newtonian clear-fluid limit the hydrodynamic solver reproduces the classical squeezing-film equation of Wang [44], with </w:t>
+        <w:t xml:space="preserve">The present trends are compared with established results for related configurations. In the Newtonian clear-fluid limit the hydrodynamic solver reproduces the classical squeezing-film equation of Wang [44], with the wall curvature </w:t>
       </w:r>
       <m:oMath>
         <m:sSup>
@@ -21932,63 +21287,21 @@
             </m:r>
           </m:sup>
         </m:sSup>
-        <m:r>
-          <m:t xml:space="preserve">(</m:t>
-        </m:r>
-        <m:r>
-          <m:t xml:space="preserve">1</m:t>
-        </m:r>
-        <m:r>
-          <m:t xml:space="preserve">)</m:t>
-        </m:r>
-      </m:oMath>
-      <w:r>
-        <w:t xml:space="preserve"> agreeing to better than 0.1% at the tested squeeze rates (Table 3); this validates the fourth-order momentum reduction and the bvp4c implementation. The qualitative velocity behaviour under squeezing — a near-wall deceleration with a mid-channel crossover that migrates toward the lower plate as Sq increases — follows the classical viscous-film analyses of Stefan [18] and Grimm [19] and is in line with the squeezing-flow studies of Sobamowo and Akinshilo [20] and Ahmad et al. [21, 22].</w:t>
+      </m:oMath>
+      <w:r>
+        <w:t xml:space="preserve"> at the upper plate agreeing to better than 0.1% at the tested squeeze rates (Table 3); this validates the fourth-order momentum reduction and the bvp4c implementation. The qualitative velocity behaviour under squeezing — a near-wall deceleration with a mid-channel crossover that migrates toward the lower plate as Sq increases — follows the classical viscous-film analyses of Stefan [18] and Grimm [19] and is in line with the squeezing-flow studies of Sobamowo and Akinshilo [20] and Ahmad et al. [21, 22].</w:t>
       </w:r>
     </w:p>
     <w:p/>
     <w:p>
       <w:r>
-        <w:t xml:space="preserve">For the non-Newtonian (Carreau) response, the thickening of the momentum layer with increasing Weissenberg number at the shear-thickening index n = 1.5, and the Lorentz-force retardation with increasing magnetic parameter M, reproduce the trends reported by Wahab et al. [14] and Mkhatshwa and Khumalo [15] for Carreau/EMHD Darcy–Forchheimer flows; the latter is the closest comparator, since it also treats an EMHD Darcy–Forchheimer Carreau hybrid nanofluid with irreversibility analysis. The flattening and moderation of the dissipation-driven temperature peak with increasing radiation parameter Rd, through the effective-conductivity grouping [</w:t>
-      </w:r>
-      <m:oMath>
-        <m:r>
-          <m:t xml:space="preserve">α</m:t>
-        </m:r>
-      </m:oMath>
-      <w:r>
-        <w:t xml:space="preserve">_</w:t>
-      </w:r>
-      <m:oMath>
-        <m:r>
-          <m:t xml:space="preserve">κ</m:t>
-        </m:r>
-      </m:oMath>
-      <w:r>
-        <w:t xml:space="preserve"> + (4/3)Rd </w:t>
-      </w:r>
-      <m:oMath>
-        <m:sSup>
-          <m:e>
-            <m:r>
-              <m:t xml:space="preserve">F</m:t>
-            </m:r>
-          </m:e>
-          <m:sup>
-            <m:r>
-              <m:t xml:space="preserve">3</m:t>
-            </m:r>
-          </m:sup>
-        </m:sSup>
-      </m:oMath>
-      <w:r>
-        <w:t xml:space="preserve">], is consistent with the nonlinear-radiation treatments of Mahanthesh et al. [32] and Shah et al. [13].</w:t>
+        <w:t xml:space="preserve">For the non-Newtonian (Carreau) response, the thickening of the momentum layer with increasing Weissenberg number We at the shear-thickening index n = 1.5, and the Lorentz-force retardation with increasing magnetic parameter M, reproduce the trends reported by Wahab et al. [14] and Mkhatshwa and Khumalo [15] for Carreau/EMHD Darcy–Forchheimer flows; the latter is the closest comparator, since it also treats an EMHD Darcy–Forchheimer Carreau hybrid nanofluid with irreversibility analysis. The flattening and moderation of the dissipation-driven temperature peak with increasing radiation parameter Rd, through the effective-conductivity grouping of Eq. (24), is consistent with the nonlinear-radiation treatments of Mahanthesh et al. [32] and Shah et al. [13].</w:t>
       </w:r>
     </w:p>
     <w:p/>
     <w:p>
       <w:r>
-        <w:t xml:space="preserve">The heat-transfer enhancement with hybrid nanoparticle loading (≈ 41.2% rise in the reduced Nusselt number as </w:t>
+        <w:t xml:space="preserve">The heat-transfer enhancement with hybrid nanoparticle loading (an increase of about 41.2% in the reduced Nusselt number as the total volume fraction </w:t>
       </w:r>
       <m:oMath>
         <m:r>
@@ -21996,7 +21309,7 @@
         </m:r>
       </m:oMath>
       <w:r>
-        <w:t xml:space="preserve"> increases from 0 to 0.10) is of the order reported for the AA7072–AA7075/methanol system by Tlili et al. [8] and for other hybrid suspensions by Suresh et al. [4], Manna et al. [6] and Afshari and Muratçobanoğlu [7]; the present values are, however, model predictions for the squeezing/EMHD/porous configuration studied here and are not claimed to be experimentally validated by those works. Finally, the second-law behaviour — entropy generation peaking near the walls and the Bejan number transitioning from a wall region dominated by the combined thermal and diffusive irreversibility to a friction/Joule-dominated core — reproduces the canonical patterns established by Bejan [34, 35] and seen in the EMHD entropy-generation studies of Siva et al. [39], Yadav and Kumar [42] and Ali et al. [41]. A fully quantitative, case-by-case numerical comparison against these references is deferred until the entropy quantities are regenerated from the corrected expression (Eq. 36).</w:t>
+        <w:t xml:space="preserve"> rises from zero to 0.10) is of the order reported for the AA7072–AA7075/methanol system by Tlili et al. [8] and for other hybrid suspensions by Suresh et al. [4], Manna et al. [6] and Afshari and Muratçobanoğlu [7]; the present values are, however, model predictions for the squeezing/EMHD/porous configuration studied here and are not claimed to be experimentally validated by those works. Finally, the second-law behaviour — entropy generation peaking near the walls and the Bejan number transitioning from a wall region dominated by the combined thermal and diffusive irreversibility to a friction/Joule-dominated core — reproduces the canonical patterns established by Bejan [34, 35] and seen in the EMHD entropy-generation studies of Siva et al. [39], Yadav and Kumar [42] and Ali et al. [41]. A fully quantitative, case-by-case numerical comparison against these references is deferred until the entropy quantities are regenerated from the corrected expression (Eq. 36).</w:t>
       </w:r>
     </w:p>
     <w:p/>
@@ -24078,9 +23391,6 @@
           <m:t xml:space="preserve">σ</m:t>
         </m:r>
       </m:oMath>
-      <w:r>
-        <w:t xml:space="preserve">*</w:t>
-      </w:r>
       <m:oMath>
         <m:sSubSup>
           <m:e>
@@ -24101,24 +23411,7 @@
         </m:sSubSup>
       </m:oMath>
       <w:r>
-        <w:t xml:space="preserve">/(k*</w:t>
-      </w:r>
-      <m:oMath>
-        <m:sSub>
-          <m:e>
-            <m:r>
-              <m:t xml:space="preserve">κ</m:t>
-            </m:r>
-          </m:e>
-          <m:sub>
-            <m:r>
-              <m:t xml:space="preserve">f</m:t>
-            </m:r>
-          </m:sub>
-        </m:sSub>
-      </m:oMath>
-      <w:r>
-        <w:t xml:space="preserve">) so that the 4/3 and 4 coefficients follow directly from the Rosseland derivation; the concentration susceptibility </w:t>
+        <w:t xml:space="preserve">/(kκ_f) so that the 4/3 and 4 coefficients follow directly from the Rosseland derivation; the concentration susceptibility </w:t>
       </w:r>
       <m:oMath>
         <m:sSub>

</xml_diff>